<commit_message>
Thay doi cau truc luu file lab1
</commit_message>
<xml_diff>
--- a/Lý Thuyết/Chương 3.docx
+++ b/Lý Thuyết/Chương 3.docx
@@ -2275,6 +2275,3056 @@
           <w:szCs w:val="32"/>
         </w:rPr>
       </w:pPr>
+      <w:proofErr w:type="spellStart"/>
+      <w:r>
+        <w:rPr>
+          <w:rFonts w:ascii="Times New Roman" w:eastAsiaTheme="minorEastAsia" w:hAnsi="Times New Roman" w:cs="Times New Roman"/>
+          <w:sz w:val="32"/>
+          <w:szCs w:val="32"/>
+        </w:rPr>
+        <w:t>Đặc</w:t>
+      </w:r>
+      <w:proofErr w:type="spellEnd"/>
+      <w:r>
+        <w:rPr>
+          <w:rFonts w:ascii="Times New Roman" w:eastAsiaTheme="minorEastAsia" w:hAnsi="Times New Roman" w:cs="Times New Roman"/>
+          <w:sz w:val="32"/>
+          <w:szCs w:val="32"/>
+        </w:rPr>
+        <w:t xml:space="preserve"> </w:t>
+      </w:r>
+      <w:proofErr w:type="spellStart"/>
+      <w:r>
+        <w:rPr>
+          <w:rFonts w:ascii="Times New Roman" w:eastAsiaTheme="minorEastAsia" w:hAnsi="Times New Roman" w:cs="Times New Roman"/>
+          <w:sz w:val="32"/>
+          <w:szCs w:val="32"/>
+        </w:rPr>
+        <w:t>điểm</w:t>
+      </w:r>
+      <w:proofErr w:type="spellEnd"/>
+    </w:p>
+    <w:p>
+      <w:pPr>
+        <w:pStyle w:val="ListParagraph"/>
+        <w:numPr>
+          <w:ilvl w:val="0"/>
+          <w:numId w:val="3"/>
+        </w:numPr>
+        <w:rPr>
+          <w:rFonts w:ascii="Times New Roman" w:eastAsiaTheme="minorEastAsia" w:hAnsi="Times New Roman" w:cs="Times New Roman"/>
+          <w:sz w:val="32"/>
+          <w:szCs w:val="32"/>
+        </w:rPr>
+      </w:pPr>
+      <w:proofErr w:type="spellStart"/>
+      <w:r>
+        <w:rPr>
+          <w:rFonts w:ascii="Times New Roman" w:eastAsiaTheme="minorEastAsia" w:hAnsi="Times New Roman" w:cs="Times New Roman"/>
+          <w:sz w:val="32"/>
+          <w:szCs w:val="32"/>
+        </w:rPr>
+        <w:t>Tính</w:t>
+      </w:r>
+      <w:proofErr w:type="spellEnd"/>
+      <w:r>
+        <w:rPr>
+          <w:rFonts w:ascii="Times New Roman" w:eastAsiaTheme="minorEastAsia" w:hAnsi="Times New Roman" w:cs="Times New Roman"/>
+          <w:sz w:val="32"/>
+          <w:szCs w:val="32"/>
+        </w:rPr>
+        <w:t xml:space="preserve"> </w:t>
+      </w:r>
+      <w:proofErr w:type="spellStart"/>
+      <w:r>
+        <w:rPr>
+          <w:rFonts w:ascii="Times New Roman" w:eastAsiaTheme="minorEastAsia" w:hAnsi="Times New Roman" w:cs="Times New Roman"/>
+          <w:sz w:val="32"/>
+          <w:szCs w:val="32"/>
+        </w:rPr>
+        <w:t>phụ</w:t>
+      </w:r>
+      <w:proofErr w:type="spellEnd"/>
+      <w:r>
+        <w:rPr>
+          <w:rFonts w:ascii="Times New Roman" w:eastAsiaTheme="minorEastAsia" w:hAnsi="Times New Roman" w:cs="Times New Roman"/>
+          <w:sz w:val="32"/>
+          <w:szCs w:val="32"/>
+        </w:rPr>
+        <w:t xml:space="preserve"> </w:t>
+      </w:r>
+      <w:proofErr w:type="spellStart"/>
+      <w:r>
+        <w:rPr>
+          <w:rFonts w:ascii="Times New Roman" w:eastAsiaTheme="minorEastAsia" w:hAnsi="Times New Roman" w:cs="Times New Roman"/>
+          <w:sz w:val="32"/>
+          <w:szCs w:val="32"/>
+        </w:rPr>
+        <w:t>thuộc</w:t>
+      </w:r>
+      <w:proofErr w:type="spellEnd"/>
+      <w:r>
+        <w:rPr>
+          <w:rFonts w:ascii="Times New Roman" w:eastAsiaTheme="minorEastAsia" w:hAnsi="Times New Roman" w:cs="Times New Roman"/>
+          <w:sz w:val="32"/>
+          <w:szCs w:val="32"/>
+        </w:rPr>
+        <w:t xml:space="preserve"> </w:t>
+      </w:r>
+      <w:proofErr w:type="spellStart"/>
+      <w:r>
+        <w:rPr>
+          <w:rFonts w:ascii="Times New Roman" w:eastAsiaTheme="minorEastAsia" w:hAnsi="Times New Roman" w:cs="Times New Roman"/>
+          <w:sz w:val="32"/>
+          <w:szCs w:val="32"/>
+        </w:rPr>
+        <w:t>theo</w:t>
+      </w:r>
+      <w:proofErr w:type="spellEnd"/>
+      <w:r>
+        <w:rPr>
+          <w:rFonts w:ascii="Times New Roman" w:eastAsiaTheme="minorEastAsia" w:hAnsi="Times New Roman" w:cs="Times New Roman"/>
+          <w:sz w:val="32"/>
+          <w:szCs w:val="32"/>
+        </w:rPr>
+        <w:t xml:space="preserve"> </w:t>
+      </w:r>
+      <w:proofErr w:type="spellStart"/>
+      <w:r>
+        <w:rPr>
+          <w:rFonts w:ascii="Times New Roman" w:eastAsiaTheme="minorEastAsia" w:hAnsi="Times New Roman" w:cs="Times New Roman"/>
+          <w:sz w:val="32"/>
+          <w:szCs w:val="32"/>
+        </w:rPr>
+        <w:t>thời</w:t>
+      </w:r>
+      <w:proofErr w:type="spellEnd"/>
+      <w:r>
+        <w:rPr>
+          <w:rFonts w:ascii="Times New Roman" w:eastAsiaTheme="minorEastAsia" w:hAnsi="Times New Roman" w:cs="Times New Roman"/>
+          <w:sz w:val="32"/>
+          <w:szCs w:val="32"/>
+        </w:rPr>
+        <w:t xml:space="preserve"> </w:t>
+      </w:r>
+      <w:proofErr w:type="spellStart"/>
+      <w:r>
+        <w:rPr>
+          <w:rFonts w:ascii="Times New Roman" w:eastAsiaTheme="minorEastAsia" w:hAnsi="Times New Roman" w:cs="Times New Roman"/>
+          <w:sz w:val="32"/>
+          <w:szCs w:val="32"/>
+        </w:rPr>
+        <w:t>gian</w:t>
+      </w:r>
+      <w:proofErr w:type="spellEnd"/>
+    </w:p>
+    <w:p>
+      <w:pPr>
+        <w:pStyle w:val="ListParagraph"/>
+        <w:numPr>
+          <w:ilvl w:val="0"/>
+          <w:numId w:val="3"/>
+        </w:numPr>
+        <w:rPr>
+          <w:rFonts w:ascii="Times New Roman" w:eastAsiaTheme="minorEastAsia" w:hAnsi="Times New Roman" w:cs="Times New Roman"/>
+          <w:sz w:val="32"/>
+          <w:szCs w:val="32"/>
+        </w:rPr>
+      </w:pPr>
+      <w:proofErr w:type="spellStart"/>
+      <w:r>
+        <w:rPr>
+          <w:rFonts w:ascii="Times New Roman" w:eastAsiaTheme="minorEastAsia" w:hAnsi="Times New Roman" w:cs="Times New Roman"/>
+          <w:sz w:val="32"/>
+          <w:szCs w:val="32"/>
+        </w:rPr>
+        <w:t>Tính</w:t>
+      </w:r>
+      <w:proofErr w:type="spellEnd"/>
+      <w:r>
+        <w:rPr>
+          <w:rFonts w:ascii="Times New Roman" w:eastAsiaTheme="minorEastAsia" w:hAnsi="Times New Roman" w:cs="Times New Roman"/>
+          <w:sz w:val="32"/>
+          <w:szCs w:val="32"/>
+        </w:rPr>
+        <w:t xml:space="preserve"> </w:t>
+      </w:r>
+      <w:proofErr w:type="spellStart"/>
+      <w:r>
+        <w:rPr>
+          <w:rFonts w:ascii="Times New Roman" w:eastAsiaTheme="minorEastAsia" w:hAnsi="Times New Roman" w:cs="Times New Roman"/>
+          <w:sz w:val="32"/>
+          <w:szCs w:val="32"/>
+        </w:rPr>
+        <w:t>lịch</w:t>
+      </w:r>
+      <w:proofErr w:type="spellEnd"/>
+      <w:r>
+        <w:rPr>
+          <w:rFonts w:ascii="Times New Roman" w:eastAsiaTheme="minorEastAsia" w:hAnsi="Times New Roman" w:cs="Times New Roman"/>
+          <w:sz w:val="32"/>
+          <w:szCs w:val="32"/>
+        </w:rPr>
+        <w:t xml:space="preserve"> </w:t>
+      </w:r>
+      <w:proofErr w:type="spellStart"/>
+      <w:r>
+        <w:rPr>
+          <w:rFonts w:ascii="Times New Roman" w:eastAsiaTheme="minorEastAsia" w:hAnsi="Times New Roman" w:cs="Times New Roman"/>
+          <w:sz w:val="32"/>
+          <w:szCs w:val="32"/>
+        </w:rPr>
+        <w:t>sử</w:t>
+      </w:r>
+      <w:proofErr w:type="spellEnd"/>
+      <w:r>
+        <w:rPr>
+          <w:rFonts w:ascii="Times New Roman" w:eastAsiaTheme="minorEastAsia" w:hAnsi="Times New Roman" w:cs="Times New Roman"/>
+          <w:sz w:val="32"/>
+          <w:szCs w:val="32"/>
+        </w:rPr>
+        <w:t xml:space="preserve"> </w:t>
+      </w:r>
+      <w:proofErr w:type="spellStart"/>
+      <w:r>
+        <w:rPr>
+          <w:rFonts w:ascii="Times New Roman" w:eastAsiaTheme="minorEastAsia" w:hAnsi="Times New Roman" w:cs="Times New Roman"/>
+          <w:sz w:val="32"/>
+          <w:szCs w:val="32"/>
+        </w:rPr>
+        <w:t>của</w:t>
+      </w:r>
+      <w:proofErr w:type="spellEnd"/>
+      <w:r>
+        <w:rPr>
+          <w:rFonts w:ascii="Times New Roman" w:eastAsiaTheme="minorEastAsia" w:hAnsi="Times New Roman" w:cs="Times New Roman"/>
+          <w:sz w:val="32"/>
+          <w:szCs w:val="32"/>
+        </w:rPr>
+        <w:t xml:space="preserve"> </w:t>
+      </w:r>
+      <w:proofErr w:type="spellStart"/>
+      <w:r>
+        <w:rPr>
+          <w:rFonts w:ascii="Times New Roman" w:eastAsiaTheme="minorEastAsia" w:hAnsi="Times New Roman" w:cs="Times New Roman"/>
+          <w:sz w:val="32"/>
+          <w:szCs w:val="32"/>
+        </w:rPr>
+        <w:t>dữ</w:t>
+      </w:r>
+      <w:proofErr w:type="spellEnd"/>
+      <w:r>
+        <w:rPr>
+          <w:rFonts w:ascii="Times New Roman" w:eastAsiaTheme="minorEastAsia" w:hAnsi="Times New Roman" w:cs="Times New Roman"/>
+          <w:sz w:val="32"/>
+          <w:szCs w:val="32"/>
+        </w:rPr>
+        <w:t xml:space="preserve"> </w:t>
+      </w:r>
+      <w:proofErr w:type="spellStart"/>
+      <w:r>
+        <w:rPr>
+          <w:rFonts w:ascii="Times New Roman" w:eastAsiaTheme="minorEastAsia" w:hAnsi="Times New Roman" w:cs="Times New Roman"/>
+          <w:sz w:val="32"/>
+          <w:szCs w:val="32"/>
+        </w:rPr>
+        <w:t>liệu</w:t>
+      </w:r>
+      <w:proofErr w:type="spellEnd"/>
+      <w:r>
+        <w:rPr>
+          <w:rFonts w:ascii="Times New Roman" w:eastAsiaTheme="minorEastAsia" w:hAnsi="Times New Roman" w:cs="Times New Roman"/>
+          <w:sz w:val="32"/>
+          <w:szCs w:val="32"/>
+        </w:rPr>
+        <w:t xml:space="preserve"> (</w:t>
+      </w:r>
+      <w:proofErr w:type="spellStart"/>
+      <w:r>
+        <w:rPr>
+          <w:rFonts w:ascii="Times New Roman" w:eastAsiaTheme="minorEastAsia" w:hAnsi="Times New Roman" w:cs="Times New Roman"/>
+          <w:sz w:val="32"/>
+          <w:szCs w:val="32"/>
+        </w:rPr>
+        <w:t>Hiện</w:t>
+      </w:r>
+      <w:proofErr w:type="spellEnd"/>
+      <w:r>
+        <w:rPr>
+          <w:rFonts w:ascii="Times New Roman" w:eastAsiaTheme="minorEastAsia" w:hAnsi="Times New Roman" w:cs="Times New Roman"/>
+          <w:sz w:val="32"/>
+          <w:szCs w:val="32"/>
+        </w:rPr>
+        <w:t xml:space="preserve"> </w:t>
+      </w:r>
+      <w:proofErr w:type="spellStart"/>
+      <w:r>
+        <w:rPr>
+          <w:rFonts w:ascii="Times New Roman" w:eastAsiaTheme="minorEastAsia" w:hAnsi="Times New Roman" w:cs="Times New Roman"/>
+          <w:sz w:val="32"/>
+          <w:szCs w:val="32"/>
+        </w:rPr>
+        <w:t>tại</w:t>
+      </w:r>
+      <w:proofErr w:type="spellEnd"/>
+      <w:r>
+        <w:rPr>
+          <w:rFonts w:ascii="Times New Roman" w:eastAsiaTheme="minorEastAsia" w:hAnsi="Times New Roman" w:cs="Times New Roman"/>
+          <w:sz w:val="32"/>
+          <w:szCs w:val="32"/>
+        </w:rPr>
+        <w:t xml:space="preserve"> </w:t>
+      </w:r>
+      <w:proofErr w:type="spellStart"/>
+      <w:r>
+        <w:rPr>
+          <w:rFonts w:ascii="Times New Roman" w:eastAsiaTheme="minorEastAsia" w:hAnsi="Times New Roman" w:cs="Times New Roman"/>
+          <w:sz w:val="32"/>
+          <w:szCs w:val="32"/>
+        </w:rPr>
+        <w:t>phụ</w:t>
+      </w:r>
+      <w:proofErr w:type="spellEnd"/>
+      <w:r>
+        <w:rPr>
+          <w:rFonts w:ascii="Times New Roman" w:eastAsiaTheme="minorEastAsia" w:hAnsi="Times New Roman" w:cs="Times New Roman"/>
+          <w:sz w:val="32"/>
+          <w:szCs w:val="32"/>
+        </w:rPr>
+        <w:t xml:space="preserve"> </w:t>
+      </w:r>
+      <w:proofErr w:type="spellStart"/>
+      <w:r>
+        <w:rPr>
+          <w:rFonts w:ascii="Times New Roman" w:eastAsiaTheme="minorEastAsia" w:hAnsi="Times New Roman" w:cs="Times New Roman"/>
+          <w:sz w:val="32"/>
+          <w:szCs w:val="32"/>
+        </w:rPr>
+        <w:t>thuộc</w:t>
+      </w:r>
+      <w:proofErr w:type="spellEnd"/>
+      <w:r>
+        <w:rPr>
+          <w:rFonts w:ascii="Times New Roman" w:eastAsiaTheme="minorEastAsia" w:hAnsi="Times New Roman" w:cs="Times New Roman"/>
+          <w:sz w:val="32"/>
+          <w:szCs w:val="32"/>
+        </w:rPr>
+        <w:t xml:space="preserve"> </w:t>
+      </w:r>
+      <w:proofErr w:type="spellStart"/>
+      <w:r>
+        <w:rPr>
+          <w:rFonts w:ascii="Times New Roman" w:eastAsiaTheme="minorEastAsia" w:hAnsi="Times New Roman" w:cs="Times New Roman"/>
+          <w:sz w:val="32"/>
+          <w:szCs w:val="32"/>
+        </w:rPr>
+        <w:t>quá</w:t>
+      </w:r>
+      <w:proofErr w:type="spellEnd"/>
+      <w:r>
+        <w:rPr>
+          <w:rFonts w:ascii="Times New Roman" w:eastAsiaTheme="minorEastAsia" w:hAnsi="Times New Roman" w:cs="Times New Roman"/>
+          <w:sz w:val="32"/>
+          <w:szCs w:val="32"/>
+        </w:rPr>
+        <w:t xml:space="preserve"> </w:t>
+      </w:r>
+      <w:proofErr w:type="spellStart"/>
+      <w:r>
+        <w:rPr>
+          <w:rFonts w:ascii="Times New Roman" w:eastAsiaTheme="minorEastAsia" w:hAnsi="Times New Roman" w:cs="Times New Roman"/>
+          <w:sz w:val="32"/>
+          <w:szCs w:val="32"/>
+        </w:rPr>
+        <w:t>khứ</w:t>
+      </w:r>
+      <w:proofErr w:type="spellEnd"/>
+      <w:r>
+        <w:rPr>
+          <w:rFonts w:ascii="Times New Roman" w:eastAsiaTheme="minorEastAsia" w:hAnsi="Times New Roman" w:cs="Times New Roman"/>
+          <w:sz w:val="32"/>
+          <w:szCs w:val="32"/>
+        </w:rPr>
+        <w:t>)</w:t>
+      </w:r>
+    </w:p>
+    <w:p>
+      <w:pPr>
+        <w:rPr>
+          <w:rFonts w:ascii="Times New Roman" w:eastAsiaTheme="minorEastAsia" w:hAnsi="Times New Roman" w:cs="Times New Roman"/>
+          <w:sz w:val="32"/>
+          <w:szCs w:val="32"/>
+        </w:rPr>
+      </w:pPr>
+      <w:proofErr w:type="spellStart"/>
+      <w:r>
+        <w:rPr>
+          <w:rFonts w:ascii="Times New Roman" w:eastAsiaTheme="minorEastAsia" w:hAnsi="Times New Roman" w:cs="Times New Roman"/>
+          <w:sz w:val="32"/>
+          <w:szCs w:val="32"/>
+        </w:rPr>
+        <w:t>Chuỗi</w:t>
+      </w:r>
+      <w:proofErr w:type="spellEnd"/>
+      <w:r>
+        <w:rPr>
+          <w:rFonts w:ascii="Times New Roman" w:eastAsiaTheme="minorEastAsia" w:hAnsi="Times New Roman" w:cs="Times New Roman"/>
+          <w:sz w:val="32"/>
+          <w:szCs w:val="32"/>
+        </w:rPr>
+        <w:t xml:space="preserve"> TG </w:t>
+      </w:r>
+      <w:proofErr w:type="spellStart"/>
+      <w:r>
+        <w:rPr>
+          <w:rFonts w:ascii="Times New Roman" w:eastAsiaTheme="minorEastAsia" w:hAnsi="Times New Roman" w:cs="Times New Roman"/>
+          <w:sz w:val="32"/>
+          <w:szCs w:val="32"/>
+        </w:rPr>
+        <w:t>đơn</w:t>
+      </w:r>
+      <w:proofErr w:type="spellEnd"/>
+      <w:r>
+        <w:rPr>
+          <w:rFonts w:ascii="Times New Roman" w:eastAsiaTheme="minorEastAsia" w:hAnsi="Times New Roman" w:cs="Times New Roman"/>
+          <w:sz w:val="32"/>
+          <w:szCs w:val="32"/>
+        </w:rPr>
+        <w:t xml:space="preserve"> </w:t>
+      </w:r>
+      <w:proofErr w:type="spellStart"/>
+      <w:r>
+        <w:rPr>
+          <w:rFonts w:ascii="Times New Roman" w:eastAsiaTheme="minorEastAsia" w:hAnsi="Times New Roman" w:cs="Times New Roman"/>
+          <w:sz w:val="32"/>
+          <w:szCs w:val="32"/>
+        </w:rPr>
+        <w:t>biến</w:t>
+      </w:r>
+      <w:proofErr w:type="spellEnd"/>
+    </w:p>
+    <w:p>
+      <w:pPr>
+        <w:pStyle w:val="ListParagraph"/>
+        <w:numPr>
+          <w:ilvl w:val="0"/>
+          <w:numId w:val="3"/>
+        </w:numPr>
+        <w:rPr>
+          <w:rFonts w:ascii="Times New Roman" w:eastAsiaTheme="minorEastAsia" w:hAnsi="Times New Roman" w:cs="Times New Roman"/>
+          <w:sz w:val="32"/>
+          <w:szCs w:val="32"/>
+        </w:rPr>
+      </w:pPr>
+      <w:proofErr w:type="spellStart"/>
+      <w:r>
+        <w:rPr>
+          <w:rFonts w:ascii="Times New Roman" w:eastAsiaTheme="minorEastAsia" w:hAnsi="Times New Roman" w:cs="Times New Roman"/>
+          <w:sz w:val="32"/>
+          <w:szCs w:val="32"/>
+        </w:rPr>
+        <w:t>Có</w:t>
+      </w:r>
+      <w:proofErr w:type="spellEnd"/>
+      <w:r>
+        <w:rPr>
+          <w:rFonts w:ascii="Times New Roman" w:eastAsiaTheme="minorEastAsia" w:hAnsi="Times New Roman" w:cs="Times New Roman"/>
+          <w:sz w:val="32"/>
+          <w:szCs w:val="32"/>
+        </w:rPr>
+        <w:t xml:space="preserve"> </w:t>
+      </w:r>
+      <w:proofErr w:type="spellStart"/>
+      <w:r>
+        <w:rPr>
+          <w:rFonts w:ascii="Times New Roman" w:eastAsiaTheme="minorEastAsia" w:hAnsi="Times New Roman" w:cs="Times New Roman"/>
+          <w:sz w:val="32"/>
+          <w:szCs w:val="32"/>
+        </w:rPr>
+        <w:t>cấu</w:t>
+      </w:r>
+      <w:proofErr w:type="spellEnd"/>
+      <w:r>
+        <w:rPr>
+          <w:rFonts w:ascii="Times New Roman" w:eastAsiaTheme="minorEastAsia" w:hAnsi="Times New Roman" w:cs="Times New Roman"/>
+          <w:sz w:val="32"/>
+          <w:szCs w:val="32"/>
+        </w:rPr>
+        <w:t xml:space="preserve"> </w:t>
+      </w:r>
+      <w:proofErr w:type="spellStart"/>
+      <w:r>
+        <w:rPr>
+          <w:rFonts w:ascii="Times New Roman" w:eastAsiaTheme="minorEastAsia" w:hAnsi="Times New Roman" w:cs="Times New Roman"/>
+          <w:sz w:val="32"/>
+          <w:szCs w:val="32"/>
+        </w:rPr>
+        <w:t>trúc</w:t>
+      </w:r>
+      <w:proofErr w:type="spellEnd"/>
+      <w:r>
+        <w:rPr>
+          <w:rFonts w:ascii="Times New Roman" w:eastAsiaTheme="minorEastAsia" w:hAnsi="Times New Roman" w:cs="Times New Roman"/>
+          <w:sz w:val="32"/>
+          <w:szCs w:val="32"/>
+        </w:rPr>
+        <w:t xml:space="preserve"> </w:t>
+      </w:r>
+      <w:proofErr w:type="spellStart"/>
+      <w:r>
+        <w:rPr>
+          <w:rFonts w:ascii="Times New Roman" w:eastAsiaTheme="minorEastAsia" w:hAnsi="Times New Roman" w:cs="Times New Roman"/>
+          <w:sz w:val="32"/>
+          <w:szCs w:val="32"/>
+        </w:rPr>
+        <w:t>phụ</w:t>
+      </w:r>
+      <w:proofErr w:type="spellEnd"/>
+      <w:r>
+        <w:rPr>
+          <w:rFonts w:ascii="Times New Roman" w:eastAsiaTheme="minorEastAsia" w:hAnsi="Times New Roman" w:cs="Times New Roman"/>
+          <w:sz w:val="32"/>
+          <w:szCs w:val="32"/>
+        </w:rPr>
+        <w:t xml:space="preserve"> </w:t>
+      </w:r>
+      <w:proofErr w:type="spellStart"/>
+      <w:r>
+        <w:rPr>
+          <w:rFonts w:ascii="Times New Roman" w:eastAsiaTheme="minorEastAsia" w:hAnsi="Times New Roman" w:cs="Times New Roman"/>
+          <w:sz w:val="32"/>
+          <w:szCs w:val="32"/>
+        </w:rPr>
+        <w:t>thuộc</w:t>
+      </w:r>
+      <w:proofErr w:type="spellEnd"/>
+      <w:r>
+        <w:rPr>
+          <w:rFonts w:ascii="Times New Roman" w:eastAsiaTheme="minorEastAsia" w:hAnsi="Times New Roman" w:cs="Times New Roman"/>
+          <w:sz w:val="32"/>
+          <w:szCs w:val="32"/>
+        </w:rPr>
+        <w:t xml:space="preserve"> </w:t>
+      </w:r>
+      <w:proofErr w:type="spellStart"/>
+      <w:r>
+        <w:rPr>
+          <w:rFonts w:ascii="Times New Roman" w:eastAsiaTheme="minorEastAsia" w:hAnsi="Times New Roman" w:cs="Times New Roman"/>
+          <w:sz w:val="32"/>
+          <w:szCs w:val="32"/>
+        </w:rPr>
+        <w:t>theo</w:t>
+      </w:r>
+      <w:proofErr w:type="spellEnd"/>
+      <w:r>
+        <w:rPr>
+          <w:rFonts w:ascii="Times New Roman" w:eastAsiaTheme="minorEastAsia" w:hAnsi="Times New Roman" w:cs="Times New Roman"/>
+          <w:sz w:val="32"/>
+          <w:szCs w:val="32"/>
+        </w:rPr>
+        <w:t xml:space="preserve"> </w:t>
+      </w:r>
+      <w:proofErr w:type="spellStart"/>
+      <w:r>
+        <w:rPr>
+          <w:rFonts w:ascii="Times New Roman" w:eastAsiaTheme="minorEastAsia" w:hAnsi="Times New Roman" w:cs="Times New Roman"/>
+          <w:sz w:val="32"/>
+          <w:szCs w:val="32"/>
+        </w:rPr>
+        <w:t>thời</w:t>
+      </w:r>
+      <w:proofErr w:type="spellEnd"/>
+      <w:r>
+        <w:rPr>
+          <w:rFonts w:ascii="Times New Roman" w:eastAsiaTheme="minorEastAsia" w:hAnsi="Times New Roman" w:cs="Times New Roman"/>
+          <w:sz w:val="32"/>
+          <w:szCs w:val="32"/>
+        </w:rPr>
+        <w:t xml:space="preserve"> </w:t>
+      </w:r>
+      <w:proofErr w:type="spellStart"/>
+      <w:r>
+        <w:rPr>
+          <w:rFonts w:ascii="Times New Roman" w:eastAsiaTheme="minorEastAsia" w:hAnsi="Times New Roman" w:cs="Times New Roman"/>
+          <w:sz w:val="32"/>
+          <w:szCs w:val="32"/>
+        </w:rPr>
+        <w:t>gian</w:t>
+      </w:r>
+      <w:proofErr w:type="spellEnd"/>
+    </w:p>
+    <w:p>
+      <w:pPr>
+        <w:pStyle w:val="ListParagraph"/>
+        <w:numPr>
+          <w:ilvl w:val="0"/>
+          <w:numId w:val="3"/>
+        </w:numPr>
+        <w:rPr>
+          <w:rFonts w:ascii="Times New Roman" w:eastAsiaTheme="minorEastAsia" w:hAnsi="Times New Roman" w:cs="Times New Roman"/>
+          <w:sz w:val="32"/>
+          <w:szCs w:val="32"/>
+        </w:rPr>
+      </w:pPr>
+      <w:proofErr w:type="spellStart"/>
+      <w:r>
+        <w:rPr>
+          <w:rFonts w:ascii="Times New Roman" w:eastAsiaTheme="minorEastAsia" w:hAnsi="Times New Roman" w:cs="Times New Roman"/>
+          <w:sz w:val="32"/>
+          <w:szCs w:val="32"/>
+        </w:rPr>
+        <w:t>Gồm</w:t>
+      </w:r>
+      <w:proofErr w:type="spellEnd"/>
+      <w:r>
+        <w:rPr>
+          <w:rFonts w:ascii="Times New Roman" w:eastAsiaTheme="minorEastAsia" w:hAnsi="Times New Roman" w:cs="Times New Roman"/>
+          <w:sz w:val="32"/>
+          <w:szCs w:val="32"/>
+        </w:rPr>
+        <w:t xml:space="preserve"> </w:t>
+      </w:r>
+      <w:proofErr w:type="spellStart"/>
+      <w:r>
+        <w:rPr>
+          <w:rFonts w:ascii="Times New Roman" w:eastAsiaTheme="minorEastAsia" w:hAnsi="Times New Roman" w:cs="Times New Roman"/>
+          <w:sz w:val="32"/>
+          <w:szCs w:val="32"/>
+        </w:rPr>
+        <w:t>nhiều</w:t>
+      </w:r>
+      <w:proofErr w:type="spellEnd"/>
+      <w:r>
+        <w:rPr>
+          <w:rFonts w:ascii="Times New Roman" w:eastAsiaTheme="minorEastAsia" w:hAnsi="Times New Roman" w:cs="Times New Roman"/>
+          <w:sz w:val="32"/>
+          <w:szCs w:val="32"/>
+        </w:rPr>
+        <w:t xml:space="preserve"> </w:t>
+      </w:r>
+      <w:proofErr w:type="spellStart"/>
+      <w:r>
+        <w:rPr>
+          <w:rFonts w:ascii="Times New Roman" w:eastAsiaTheme="minorEastAsia" w:hAnsi="Times New Roman" w:cs="Times New Roman"/>
+          <w:sz w:val="32"/>
+          <w:szCs w:val="32"/>
+        </w:rPr>
+        <w:t>thành</w:t>
+      </w:r>
+      <w:proofErr w:type="spellEnd"/>
+      <w:r>
+        <w:rPr>
+          <w:rFonts w:ascii="Times New Roman" w:eastAsiaTheme="minorEastAsia" w:hAnsi="Times New Roman" w:cs="Times New Roman"/>
+          <w:sz w:val="32"/>
+          <w:szCs w:val="32"/>
+        </w:rPr>
+        <w:t xml:space="preserve"> </w:t>
+      </w:r>
+      <w:proofErr w:type="spellStart"/>
+      <w:r>
+        <w:rPr>
+          <w:rFonts w:ascii="Times New Roman" w:eastAsiaTheme="minorEastAsia" w:hAnsi="Times New Roman" w:cs="Times New Roman"/>
+          <w:sz w:val="32"/>
+          <w:szCs w:val="32"/>
+        </w:rPr>
+        <w:t>phần</w:t>
+      </w:r>
+      <w:proofErr w:type="spellEnd"/>
+      <w:r>
+        <w:rPr>
+          <w:rFonts w:ascii="Times New Roman" w:eastAsiaTheme="minorEastAsia" w:hAnsi="Times New Roman" w:cs="Times New Roman"/>
+          <w:sz w:val="32"/>
+          <w:szCs w:val="32"/>
+        </w:rPr>
+        <w:t xml:space="preserve"> (decomposition)</w:t>
+      </w:r>
+    </w:p>
+    <w:p>
+      <w:pPr>
+        <w:pStyle w:val="ListParagraph"/>
+        <w:numPr>
+          <w:ilvl w:val="0"/>
+          <w:numId w:val="3"/>
+        </w:numPr>
+        <w:rPr>
+          <w:rFonts w:ascii="Times New Roman" w:eastAsiaTheme="minorEastAsia" w:hAnsi="Times New Roman" w:cs="Times New Roman"/>
+          <w:sz w:val="32"/>
+          <w:szCs w:val="32"/>
+        </w:rPr>
+      </w:pPr>
+      <w:proofErr w:type="spellStart"/>
+      <w:r>
+        <w:rPr>
+          <w:rFonts w:ascii="Times New Roman" w:eastAsiaTheme="minorEastAsia" w:hAnsi="Times New Roman" w:cs="Times New Roman"/>
+          <w:sz w:val="32"/>
+          <w:szCs w:val="32"/>
+        </w:rPr>
+        <w:t>Đặc</w:t>
+      </w:r>
+      <w:proofErr w:type="spellEnd"/>
+      <w:r>
+        <w:rPr>
+          <w:rFonts w:ascii="Times New Roman" w:eastAsiaTheme="minorEastAsia" w:hAnsi="Times New Roman" w:cs="Times New Roman"/>
+          <w:sz w:val="32"/>
+          <w:szCs w:val="32"/>
+        </w:rPr>
+        <w:t xml:space="preserve"> </w:t>
+      </w:r>
+      <w:proofErr w:type="spellStart"/>
+      <w:r>
+        <w:rPr>
+          <w:rFonts w:ascii="Times New Roman" w:eastAsiaTheme="minorEastAsia" w:hAnsi="Times New Roman" w:cs="Times New Roman"/>
+          <w:sz w:val="32"/>
+          <w:szCs w:val="32"/>
+        </w:rPr>
+        <w:t>trưng</w:t>
+      </w:r>
+      <w:proofErr w:type="spellEnd"/>
+      <w:r>
+        <w:rPr>
+          <w:rFonts w:ascii="Times New Roman" w:eastAsiaTheme="minorEastAsia" w:hAnsi="Times New Roman" w:cs="Times New Roman"/>
+          <w:sz w:val="32"/>
+          <w:szCs w:val="32"/>
+        </w:rPr>
+        <w:t xml:space="preserve"> </w:t>
+      </w:r>
+      <w:proofErr w:type="spellStart"/>
+      <w:r>
+        <w:rPr>
+          <w:rFonts w:ascii="Times New Roman" w:eastAsiaTheme="minorEastAsia" w:hAnsi="Times New Roman" w:cs="Times New Roman"/>
+          <w:sz w:val="32"/>
+          <w:szCs w:val="32"/>
+        </w:rPr>
+        <w:t>quan</w:t>
+      </w:r>
+      <w:proofErr w:type="spellEnd"/>
+      <w:r>
+        <w:rPr>
+          <w:rFonts w:ascii="Times New Roman" w:eastAsiaTheme="minorEastAsia" w:hAnsi="Times New Roman" w:cs="Times New Roman"/>
+          <w:sz w:val="32"/>
+          <w:szCs w:val="32"/>
+        </w:rPr>
+        <w:t xml:space="preserve"> </w:t>
+      </w:r>
+      <w:proofErr w:type="spellStart"/>
+      <w:r>
+        <w:rPr>
+          <w:rFonts w:ascii="Times New Roman" w:eastAsiaTheme="minorEastAsia" w:hAnsi="Times New Roman" w:cs="Times New Roman"/>
+          <w:sz w:val="32"/>
+          <w:szCs w:val="32"/>
+        </w:rPr>
+        <w:t>trọng</w:t>
+      </w:r>
+      <w:proofErr w:type="spellEnd"/>
+      <w:r>
+        <w:rPr>
+          <w:rFonts w:ascii="Times New Roman" w:eastAsiaTheme="minorEastAsia" w:hAnsi="Times New Roman" w:cs="Times New Roman"/>
+          <w:sz w:val="32"/>
+          <w:szCs w:val="32"/>
+        </w:rPr>
+        <w:t xml:space="preserve">: </w:t>
+      </w:r>
+      <w:proofErr w:type="spellStart"/>
+      <w:r>
+        <w:rPr>
+          <w:rFonts w:ascii="Times New Roman" w:eastAsiaTheme="minorEastAsia" w:hAnsi="Times New Roman" w:cs="Times New Roman"/>
+          <w:sz w:val="32"/>
+          <w:szCs w:val="32"/>
+        </w:rPr>
+        <w:t>Tính</w:t>
+      </w:r>
+      <w:proofErr w:type="spellEnd"/>
+      <w:r>
+        <w:rPr>
+          <w:rFonts w:ascii="Times New Roman" w:eastAsiaTheme="minorEastAsia" w:hAnsi="Times New Roman" w:cs="Times New Roman"/>
+          <w:sz w:val="32"/>
+          <w:szCs w:val="32"/>
+        </w:rPr>
+        <w:t xml:space="preserve"> </w:t>
+      </w:r>
+      <w:proofErr w:type="spellStart"/>
+      <w:r>
+        <w:rPr>
+          <w:rFonts w:ascii="Times New Roman" w:eastAsiaTheme="minorEastAsia" w:hAnsi="Times New Roman" w:cs="Times New Roman"/>
+          <w:sz w:val="32"/>
+          <w:szCs w:val="32"/>
+        </w:rPr>
+        <w:t>dừng</w:t>
+      </w:r>
+      <w:proofErr w:type="spellEnd"/>
+      <w:r>
+        <w:rPr>
+          <w:rFonts w:ascii="Times New Roman" w:eastAsiaTheme="minorEastAsia" w:hAnsi="Times New Roman" w:cs="Times New Roman"/>
+          <w:sz w:val="32"/>
+          <w:szCs w:val="32"/>
+        </w:rPr>
+        <w:t>, Autocorrelation, Irregular</w:t>
+      </w:r>
+    </w:p>
+    <w:p>
+      <w:pPr>
+        <w:rPr>
+          <w:rFonts w:ascii="Times New Roman" w:eastAsiaTheme="minorEastAsia" w:hAnsi="Times New Roman" w:cs="Times New Roman"/>
+          <w:sz w:val="32"/>
+          <w:szCs w:val="32"/>
+        </w:rPr>
+      </w:pPr>
+      <w:proofErr w:type="spellStart"/>
+      <w:r>
+        <w:rPr>
+          <w:rFonts w:ascii="Times New Roman" w:eastAsiaTheme="minorEastAsia" w:hAnsi="Times New Roman" w:cs="Times New Roman"/>
+          <w:sz w:val="32"/>
+          <w:szCs w:val="32"/>
+        </w:rPr>
+        <w:lastRenderedPageBreak/>
+        <w:t>Tính</w:t>
+      </w:r>
+      <w:proofErr w:type="spellEnd"/>
+      <w:r>
+        <w:rPr>
+          <w:rFonts w:ascii="Times New Roman" w:eastAsiaTheme="minorEastAsia" w:hAnsi="Times New Roman" w:cs="Times New Roman"/>
+          <w:sz w:val="32"/>
+          <w:szCs w:val="32"/>
+        </w:rPr>
+        <w:t xml:space="preserve"> </w:t>
+      </w:r>
+      <w:proofErr w:type="spellStart"/>
+      <w:r>
+        <w:rPr>
+          <w:rFonts w:ascii="Times New Roman" w:eastAsiaTheme="minorEastAsia" w:hAnsi="Times New Roman" w:cs="Times New Roman"/>
+          <w:sz w:val="32"/>
+          <w:szCs w:val="32"/>
+        </w:rPr>
+        <w:t>dừng</w:t>
+      </w:r>
+      <w:proofErr w:type="spellEnd"/>
+      <w:r>
+        <w:rPr>
+          <w:rFonts w:ascii="Times New Roman" w:eastAsiaTheme="minorEastAsia" w:hAnsi="Times New Roman" w:cs="Times New Roman"/>
+          <w:sz w:val="32"/>
+          <w:szCs w:val="32"/>
+        </w:rPr>
+        <w:t xml:space="preserve"> (Stationarity) </w:t>
+      </w:r>
+    </w:p>
+    <w:p>
+      <w:pPr>
+        <w:pStyle w:val="ListParagraph"/>
+        <w:numPr>
+          <w:ilvl w:val="0"/>
+          <w:numId w:val="3"/>
+        </w:numPr>
+        <w:rPr>
+          <w:rFonts w:ascii="Times New Roman" w:eastAsiaTheme="minorEastAsia" w:hAnsi="Times New Roman" w:cs="Times New Roman"/>
+          <w:sz w:val="32"/>
+          <w:szCs w:val="32"/>
+        </w:rPr>
+      </w:pPr>
+      <w:proofErr w:type="spellStart"/>
+      <w:r>
+        <w:rPr>
+          <w:rFonts w:ascii="Times New Roman" w:eastAsiaTheme="minorEastAsia" w:hAnsi="Times New Roman" w:cs="Times New Roman"/>
+          <w:sz w:val="32"/>
+          <w:szCs w:val="32"/>
+        </w:rPr>
+        <w:t>Kỳ</w:t>
+      </w:r>
+      <w:proofErr w:type="spellEnd"/>
+      <w:r>
+        <w:rPr>
+          <w:rFonts w:ascii="Times New Roman" w:eastAsiaTheme="minorEastAsia" w:hAnsi="Times New Roman" w:cs="Times New Roman"/>
+          <w:sz w:val="32"/>
+          <w:szCs w:val="32"/>
+        </w:rPr>
+        <w:t xml:space="preserve"> </w:t>
+      </w:r>
+      <w:proofErr w:type="spellStart"/>
+      <w:r>
+        <w:rPr>
+          <w:rFonts w:ascii="Times New Roman" w:eastAsiaTheme="minorEastAsia" w:hAnsi="Times New Roman" w:cs="Times New Roman"/>
+          <w:sz w:val="32"/>
+          <w:szCs w:val="32"/>
+        </w:rPr>
+        <w:t>vọng</w:t>
+      </w:r>
+      <w:proofErr w:type="spellEnd"/>
+      <w:r>
+        <w:rPr>
+          <w:rFonts w:ascii="Times New Roman" w:eastAsiaTheme="minorEastAsia" w:hAnsi="Times New Roman" w:cs="Times New Roman"/>
+          <w:sz w:val="32"/>
+          <w:szCs w:val="32"/>
+        </w:rPr>
+        <w:t xml:space="preserve"> (mean): </w:t>
+      </w:r>
+      <w:proofErr w:type="spellStart"/>
+      <w:r>
+        <w:rPr>
+          <w:rFonts w:ascii="Times New Roman" w:eastAsiaTheme="minorEastAsia" w:hAnsi="Times New Roman" w:cs="Times New Roman"/>
+          <w:sz w:val="32"/>
+          <w:szCs w:val="32"/>
+        </w:rPr>
+        <w:t>Không</w:t>
+      </w:r>
+      <w:proofErr w:type="spellEnd"/>
+      <w:r>
+        <w:rPr>
+          <w:rFonts w:ascii="Times New Roman" w:eastAsiaTheme="minorEastAsia" w:hAnsi="Times New Roman" w:cs="Times New Roman"/>
+          <w:sz w:val="32"/>
+          <w:szCs w:val="32"/>
+        </w:rPr>
+        <w:t xml:space="preserve"> </w:t>
+      </w:r>
+      <w:proofErr w:type="spellStart"/>
+      <w:r>
+        <w:rPr>
+          <w:rFonts w:ascii="Times New Roman" w:eastAsiaTheme="minorEastAsia" w:hAnsi="Times New Roman" w:cs="Times New Roman"/>
+          <w:sz w:val="32"/>
+          <w:szCs w:val="32"/>
+        </w:rPr>
+        <w:t>đổi</w:t>
+      </w:r>
+      <w:proofErr w:type="spellEnd"/>
+      <w:r>
+        <w:rPr>
+          <w:rFonts w:ascii="Times New Roman" w:eastAsiaTheme="minorEastAsia" w:hAnsi="Times New Roman" w:cs="Times New Roman"/>
+          <w:sz w:val="32"/>
+          <w:szCs w:val="32"/>
+        </w:rPr>
+        <w:t xml:space="preserve"> (= </w:t>
+      </w:r>
+      <w:proofErr w:type="spellStart"/>
+      <w:r>
+        <w:rPr>
+          <w:rFonts w:ascii="Times New Roman" w:eastAsiaTheme="minorEastAsia" w:hAnsi="Times New Roman" w:cs="Times New Roman"/>
+          <w:sz w:val="32"/>
+          <w:szCs w:val="32"/>
+        </w:rPr>
+        <w:t>constance</w:t>
+      </w:r>
+      <w:proofErr w:type="spellEnd"/>
+      <w:r>
+        <w:rPr>
+          <w:rFonts w:ascii="Times New Roman" w:eastAsiaTheme="minorEastAsia" w:hAnsi="Times New Roman" w:cs="Times New Roman"/>
+          <w:sz w:val="32"/>
+          <w:szCs w:val="32"/>
+        </w:rPr>
+        <w:t>)</w:t>
+      </w:r>
+    </w:p>
+    <w:p>
+      <w:pPr>
+        <w:pStyle w:val="ListParagraph"/>
+        <w:numPr>
+          <w:ilvl w:val="0"/>
+          <w:numId w:val="3"/>
+        </w:numPr>
+        <w:rPr>
+          <w:rFonts w:ascii="Times New Roman" w:eastAsiaTheme="minorEastAsia" w:hAnsi="Times New Roman" w:cs="Times New Roman"/>
+          <w:sz w:val="32"/>
+          <w:szCs w:val="32"/>
+        </w:rPr>
+      </w:pPr>
+      <w:r>
+        <w:rPr>
+          <w:rFonts w:ascii="Times New Roman" w:eastAsiaTheme="minorEastAsia" w:hAnsi="Times New Roman" w:cs="Times New Roman"/>
+          <w:sz w:val="32"/>
+          <w:szCs w:val="32"/>
+        </w:rPr>
+        <w:t xml:space="preserve">Phương </w:t>
+      </w:r>
+      <w:proofErr w:type="spellStart"/>
+      <w:r>
+        <w:rPr>
+          <w:rFonts w:ascii="Times New Roman" w:eastAsiaTheme="minorEastAsia" w:hAnsi="Times New Roman" w:cs="Times New Roman"/>
+          <w:sz w:val="32"/>
+          <w:szCs w:val="32"/>
+        </w:rPr>
+        <w:t>sai</w:t>
+      </w:r>
+      <w:proofErr w:type="spellEnd"/>
+      <w:r>
+        <w:rPr>
+          <w:rFonts w:ascii="Times New Roman" w:eastAsiaTheme="minorEastAsia" w:hAnsi="Times New Roman" w:cs="Times New Roman"/>
+          <w:sz w:val="32"/>
+          <w:szCs w:val="32"/>
+        </w:rPr>
+        <w:t xml:space="preserve"> </w:t>
+      </w:r>
+      <w:proofErr w:type="spellStart"/>
+      <w:r>
+        <w:rPr>
+          <w:rFonts w:ascii="Times New Roman" w:eastAsiaTheme="minorEastAsia" w:hAnsi="Times New Roman" w:cs="Times New Roman"/>
+          <w:sz w:val="32"/>
+          <w:szCs w:val="32"/>
+        </w:rPr>
+        <w:t>không</w:t>
+      </w:r>
+      <w:proofErr w:type="spellEnd"/>
+      <w:r>
+        <w:rPr>
+          <w:rFonts w:ascii="Times New Roman" w:eastAsiaTheme="minorEastAsia" w:hAnsi="Times New Roman" w:cs="Times New Roman"/>
+          <w:sz w:val="32"/>
+          <w:szCs w:val="32"/>
+        </w:rPr>
+        <w:t xml:space="preserve"> </w:t>
+      </w:r>
+      <w:proofErr w:type="spellStart"/>
+      <w:r>
+        <w:rPr>
+          <w:rFonts w:ascii="Times New Roman" w:eastAsiaTheme="minorEastAsia" w:hAnsi="Times New Roman" w:cs="Times New Roman"/>
+          <w:sz w:val="32"/>
+          <w:szCs w:val="32"/>
+        </w:rPr>
+        <w:t>đổi</w:t>
+      </w:r>
+      <w:proofErr w:type="spellEnd"/>
+    </w:p>
+    <w:p>
+      <w:pPr>
+        <w:pStyle w:val="ListParagraph"/>
+        <w:numPr>
+          <w:ilvl w:val="0"/>
+          <w:numId w:val="3"/>
+        </w:numPr>
+        <w:rPr>
+          <w:rFonts w:ascii="Times New Roman" w:eastAsiaTheme="minorEastAsia" w:hAnsi="Times New Roman" w:cs="Times New Roman"/>
+          <w:sz w:val="32"/>
+          <w:szCs w:val="32"/>
+        </w:rPr>
+      </w:pPr>
+      <w:proofErr w:type="spellStart"/>
+      <w:r>
+        <w:rPr>
+          <w:rFonts w:ascii="Times New Roman" w:eastAsiaTheme="minorEastAsia" w:hAnsi="Times New Roman" w:cs="Times New Roman"/>
+          <w:sz w:val="32"/>
+          <w:szCs w:val="32"/>
+        </w:rPr>
+        <w:t>Cấu</w:t>
+      </w:r>
+      <w:proofErr w:type="spellEnd"/>
+      <w:r>
+        <w:rPr>
+          <w:rFonts w:ascii="Times New Roman" w:eastAsiaTheme="minorEastAsia" w:hAnsi="Times New Roman" w:cs="Times New Roman"/>
+          <w:sz w:val="32"/>
+          <w:szCs w:val="32"/>
+        </w:rPr>
+        <w:t xml:space="preserve"> </w:t>
+      </w:r>
+      <w:proofErr w:type="spellStart"/>
+      <w:r>
+        <w:rPr>
+          <w:rFonts w:ascii="Times New Roman" w:eastAsiaTheme="minorEastAsia" w:hAnsi="Times New Roman" w:cs="Times New Roman"/>
+          <w:sz w:val="32"/>
+          <w:szCs w:val="32"/>
+        </w:rPr>
+        <w:t>trúc</w:t>
+      </w:r>
+      <w:proofErr w:type="spellEnd"/>
+      <w:r>
+        <w:rPr>
+          <w:rFonts w:ascii="Times New Roman" w:eastAsiaTheme="minorEastAsia" w:hAnsi="Times New Roman" w:cs="Times New Roman"/>
+          <w:sz w:val="32"/>
+          <w:szCs w:val="32"/>
+        </w:rPr>
+        <w:t xml:space="preserve"> </w:t>
+      </w:r>
+      <w:proofErr w:type="spellStart"/>
+      <w:r>
+        <w:rPr>
+          <w:rFonts w:ascii="Times New Roman" w:eastAsiaTheme="minorEastAsia" w:hAnsi="Times New Roman" w:cs="Times New Roman"/>
+          <w:sz w:val="32"/>
+          <w:szCs w:val="32"/>
+        </w:rPr>
+        <w:t>Autocorrealtion</w:t>
+      </w:r>
+      <w:proofErr w:type="spellEnd"/>
+      <w:r>
+        <w:rPr>
+          <w:rFonts w:ascii="Times New Roman" w:eastAsiaTheme="minorEastAsia" w:hAnsi="Times New Roman" w:cs="Times New Roman"/>
+          <w:sz w:val="32"/>
+          <w:szCs w:val="32"/>
+        </w:rPr>
+        <w:t xml:space="preserve"> </w:t>
+      </w:r>
+      <w:proofErr w:type="spellStart"/>
+      <w:r>
+        <w:rPr>
+          <w:rFonts w:ascii="Times New Roman" w:eastAsiaTheme="minorEastAsia" w:hAnsi="Times New Roman" w:cs="Times New Roman"/>
+          <w:sz w:val="32"/>
+          <w:szCs w:val="32"/>
+        </w:rPr>
+        <w:t>không</w:t>
+      </w:r>
+      <w:proofErr w:type="spellEnd"/>
+      <w:r>
+        <w:rPr>
+          <w:rFonts w:ascii="Times New Roman" w:eastAsiaTheme="minorEastAsia" w:hAnsi="Times New Roman" w:cs="Times New Roman"/>
+          <w:sz w:val="32"/>
+          <w:szCs w:val="32"/>
+        </w:rPr>
+        <w:t xml:space="preserve"> </w:t>
+      </w:r>
+      <w:proofErr w:type="spellStart"/>
+      <w:r>
+        <w:rPr>
+          <w:rFonts w:ascii="Times New Roman" w:eastAsiaTheme="minorEastAsia" w:hAnsi="Times New Roman" w:cs="Times New Roman"/>
+          <w:sz w:val="32"/>
+          <w:szCs w:val="32"/>
+        </w:rPr>
+        <w:t>đổi</w:t>
+      </w:r>
+      <w:proofErr w:type="spellEnd"/>
+      <w:r>
+        <w:rPr>
+          <w:rFonts w:ascii="Times New Roman" w:eastAsiaTheme="minorEastAsia" w:hAnsi="Times New Roman" w:cs="Times New Roman"/>
+          <w:sz w:val="32"/>
+          <w:szCs w:val="32"/>
+        </w:rPr>
+        <w:t xml:space="preserve"> </w:t>
+      </w:r>
+      <w:proofErr w:type="spellStart"/>
+      <w:r>
+        <w:rPr>
+          <w:rFonts w:ascii="Times New Roman" w:eastAsiaTheme="minorEastAsia" w:hAnsi="Times New Roman" w:cs="Times New Roman"/>
+          <w:sz w:val="32"/>
+          <w:szCs w:val="32"/>
+        </w:rPr>
+        <w:t>theo</w:t>
+      </w:r>
+      <w:proofErr w:type="spellEnd"/>
+      <w:r>
+        <w:rPr>
+          <w:rFonts w:ascii="Times New Roman" w:eastAsiaTheme="minorEastAsia" w:hAnsi="Times New Roman" w:cs="Times New Roman"/>
+          <w:sz w:val="32"/>
+          <w:szCs w:val="32"/>
+        </w:rPr>
+        <w:t xml:space="preserve"> TG</w:t>
+      </w:r>
+    </w:p>
+    <w:p>
+      <w:pPr>
+        <w:pStyle w:val="ListParagraph"/>
+        <w:numPr>
+          <w:ilvl w:val="0"/>
+          <w:numId w:val="3"/>
+        </w:numPr>
+        <w:rPr>
+          <w:rFonts w:ascii="Times New Roman" w:eastAsiaTheme="minorEastAsia" w:hAnsi="Times New Roman" w:cs="Times New Roman"/>
+          <w:sz w:val="32"/>
+          <w:szCs w:val="32"/>
+        </w:rPr>
+      </w:pPr>
+      <w:proofErr w:type="spellStart"/>
+      <w:r>
+        <w:rPr>
+          <w:rFonts w:ascii="Times New Roman" w:eastAsiaTheme="minorEastAsia" w:hAnsi="Times New Roman" w:cs="Times New Roman"/>
+          <w:sz w:val="32"/>
+          <w:szCs w:val="32"/>
+        </w:rPr>
+        <w:t>Giả</w:t>
+      </w:r>
+      <w:proofErr w:type="spellEnd"/>
+      <w:r>
+        <w:rPr>
+          <w:rFonts w:ascii="Times New Roman" w:eastAsiaTheme="minorEastAsia" w:hAnsi="Times New Roman" w:cs="Times New Roman"/>
+          <w:sz w:val="32"/>
+          <w:szCs w:val="32"/>
+        </w:rPr>
+        <w:t xml:space="preserve"> </w:t>
+      </w:r>
+      <w:proofErr w:type="spellStart"/>
+      <w:r>
+        <w:rPr>
+          <w:rFonts w:ascii="Times New Roman" w:eastAsiaTheme="minorEastAsia" w:hAnsi="Times New Roman" w:cs="Times New Roman"/>
+          <w:sz w:val="32"/>
+          <w:szCs w:val="32"/>
+        </w:rPr>
+        <w:t>định</w:t>
+      </w:r>
+      <w:proofErr w:type="spellEnd"/>
+      <w:r>
+        <w:rPr>
+          <w:rFonts w:ascii="Times New Roman" w:eastAsiaTheme="minorEastAsia" w:hAnsi="Times New Roman" w:cs="Times New Roman"/>
+          <w:sz w:val="32"/>
+          <w:szCs w:val="32"/>
+        </w:rPr>
+        <w:t xml:space="preserve"> </w:t>
+      </w:r>
+      <w:proofErr w:type="spellStart"/>
+      <w:r>
+        <w:rPr>
+          <w:rFonts w:ascii="Times New Roman" w:eastAsiaTheme="minorEastAsia" w:hAnsi="Times New Roman" w:cs="Times New Roman"/>
+          <w:sz w:val="32"/>
+          <w:szCs w:val="32"/>
+        </w:rPr>
+        <w:t>quan</w:t>
+      </w:r>
+      <w:proofErr w:type="spellEnd"/>
+      <w:r>
+        <w:rPr>
+          <w:rFonts w:ascii="Times New Roman" w:eastAsiaTheme="minorEastAsia" w:hAnsi="Times New Roman" w:cs="Times New Roman"/>
+          <w:sz w:val="32"/>
+          <w:szCs w:val="32"/>
+        </w:rPr>
+        <w:t xml:space="preserve"> </w:t>
+      </w:r>
+      <w:proofErr w:type="spellStart"/>
+      <w:r>
+        <w:rPr>
+          <w:rFonts w:ascii="Times New Roman" w:eastAsiaTheme="minorEastAsia" w:hAnsi="Times New Roman" w:cs="Times New Roman"/>
+          <w:sz w:val="32"/>
+          <w:szCs w:val="32"/>
+        </w:rPr>
+        <w:t>trọng</w:t>
+      </w:r>
+      <w:proofErr w:type="spellEnd"/>
+      <w:r>
+        <w:rPr>
+          <w:rFonts w:ascii="Times New Roman" w:eastAsiaTheme="minorEastAsia" w:hAnsi="Times New Roman" w:cs="Times New Roman"/>
+          <w:sz w:val="32"/>
+          <w:szCs w:val="32"/>
+        </w:rPr>
+        <w:t xml:space="preserve"> </w:t>
+      </w:r>
+      <w:proofErr w:type="spellStart"/>
+      <w:r>
+        <w:rPr>
+          <w:rFonts w:ascii="Times New Roman" w:eastAsiaTheme="minorEastAsia" w:hAnsi="Times New Roman" w:cs="Times New Roman"/>
+          <w:sz w:val="32"/>
+          <w:szCs w:val="32"/>
+        </w:rPr>
+        <w:t>của</w:t>
+      </w:r>
+      <w:proofErr w:type="spellEnd"/>
+      <w:r>
+        <w:rPr>
+          <w:rFonts w:ascii="Times New Roman" w:eastAsiaTheme="minorEastAsia" w:hAnsi="Times New Roman" w:cs="Times New Roman"/>
+          <w:sz w:val="32"/>
+          <w:szCs w:val="32"/>
+        </w:rPr>
+        <w:t xml:space="preserve"> </w:t>
+      </w:r>
+      <w:proofErr w:type="spellStart"/>
+      <w:r>
+        <w:rPr>
+          <w:rFonts w:ascii="Times New Roman" w:eastAsiaTheme="minorEastAsia" w:hAnsi="Times New Roman" w:cs="Times New Roman"/>
+          <w:sz w:val="32"/>
+          <w:szCs w:val="32"/>
+        </w:rPr>
+        <w:t>nhiều</w:t>
+      </w:r>
+      <w:proofErr w:type="spellEnd"/>
+      <w:r>
+        <w:rPr>
+          <w:rFonts w:ascii="Times New Roman" w:eastAsiaTheme="minorEastAsia" w:hAnsi="Times New Roman" w:cs="Times New Roman"/>
+          <w:sz w:val="32"/>
+          <w:szCs w:val="32"/>
+        </w:rPr>
+        <w:t xml:space="preserve"> </w:t>
+      </w:r>
+      <w:proofErr w:type="spellStart"/>
+      <w:r>
+        <w:rPr>
+          <w:rFonts w:ascii="Times New Roman" w:eastAsiaTheme="minorEastAsia" w:hAnsi="Times New Roman" w:cs="Times New Roman"/>
+          <w:sz w:val="32"/>
+          <w:szCs w:val="32"/>
+        </w:rPr>
+        <w:t>mô</w:t>
+      </w:r>
+      <w:proofErr w:type="spellEnd"/>
+      <w:r>
+        <w:rPr>
+          <w:rFonts w:ascii="Times New Roman" w:eastAsiaTheme="minorEastAsia" w:hAnsi="Times New Roman" w:cs="Times New Roman"/>
+          <w:sz w:val="32"/>
+          <w:szCs w:val="32"/>
+        </w:rPr>
+        <w:t xml:space="preserve"> </w:t>
+      </w:r>
+      <w:proofErr w:type="spellStart"/>
+      <w:r>
+        <w:rPr>
+          <w:rFonts w:ascii="Times New Roman" w:eastAsiaTheme="minorEastAsia" w:hAnsi="Times New Roman" w:cs="Times New Roman"/>
+          <w:sz w:val="32"/>
+          <w:szCs w:val="32"/>
+        </w:rPr>
+        <w:t>hình</w:t>
+      </w:r>
+      <w:proofErr w:type="spellEnd"/>
+      <w:r>
+        <w:rPr>
+          <w:rFonts w:ascii="Times New Roman" w:eastAsiaTheme="minorEastAsia" w:hAnsi="Times New Roman" w:cs="Times New Roman"/>
+          <w:sz w:val="32"/>
+          <w:szCs w:val="32"/>
+        </w:rPr>
+        <w:t xml:space="preserve"> Rolling Feature (</w:t>
+      </w:r>
+      <w:proofErr w:type="spellStart"/>
+      <w:r>
+        <w:rPr>
+          <w:rFonts w:ascii="Times New Roman" w:eastAsiaTheme="minorEastAsia" w:hAnsi="Times New Roman" w:cs="Times New Roman"/>
+          <w:sz w:val="32"/>
+          <w:szCs w:val="32"/>
+        </w:rPr>
+        <w:t>Thống</w:t>
+      </w:r>
+      <w:proofErr w:type="spellEnd"/>
+      <w:r>
+        <w:rPr>
+          <w:rFonts w:ascii="Times New Roman" w:eastAsiaTheme="minorEastAsia" w:hAnsi="Times New Roman" w:cs="Times New Roman"/>
+          <w:sz w:val="32"/>
+          <w:szCs w:val="32"/>
+        </w:rPr>
+        <w:t xml:space="preserve"> </w:t>
+      </w:r>
+      <w:proofErr w:type="spellStart"/>
+      <w:r>
+        <w:rPr>
+          <w:rFonts w:ascii="Times New Roman" w:eastAsiaTheme="minorEastAsia" w:hAnsi="Times New Roman" w:cs="Times New Roman"/>
+          <w:sz w:val="32"/>
+          <w:szCs w:val="32"/>
+        </w:rPr>
+        <w:t>kê</w:t>
+      </w:r>
+      <w:proofErr w:type="spellEnd"/>
+      <w:r>
+        <w:rPr>
+          <w:rFonts w:ascii="Times New Roman" w:eastAsiaTheme="minorEastAsia" w:hAnsi="Times New Roman" w:cs="Times New Roman"/>
+          <w:sz w:val="32"/>
+          <w:szCs w:val="32"/>
+        </w:rPr>
+        <w:t xml:space="preserve">) -&gt; </w:t>
+      </w:r>
+      <w:proofErr w:type="spellStart"/>
+      <w:r>
+        <w:rPr>
+          <w:rFonts w:ascii="Times New Roman" w:eastAsiaTheme="minorEastAsia" w:hAnsi="Times New Roman" w:cs="Times New Roman"/>
+          <w:sz w:val="32"/>
+          <w:szCs w:val="32"/>
+        </w:rPr>
+        <w:t>Dễ</w:t>
+      </w:r>
+      <w:proofErr w:type="spellEnd"/>
+      <w:r>
+        <w:rPr>
+          <w:rFonts w:ascii="Times New Roman" w:eastAsiaTheme="minorEastAsia" w:hAnsi="Times New Roman" w:cs="Times New Roman"/>
+          <w:sz w:val="32"/>
+          <w:szCs w:val="32"/>
+        </w:rPr>
+        <w:t xml:space="preserve"> </w:t>
+      </w:r>
+      <w:proofErr w:type="spellStart"/>
+      <w:r>
+        <w:rPr>
+          <w:rFonts w:ascii="Times New Roman" w:eastAsiaTheme="minorEastAsia" w:hAnsi="Times New Roman" w:cs="Times New Roman"/>
+          <w:sz w:val="32"/>
+          <w:szCs w:val="32"/>
+        </w:rPr>
+        <w:t>bị</w:t>
+      </w:r>
+      <w:proofErr w:type="spellEnd"/>
+      <w:r>
+        <w:rPr>
+          <w:rFonts w:ascii="Times New Roman" w:eastAsiaTheme="minorEastAsia" w:hAnsi="Times New Roman" w:cs="Times New Roman"/>
+          <w:sz w:val="32"/>
+          <w:szCs w:val="32"/>
+        </w:rPr>
+        <w:t xml:space="preserve"> bias</w:t>
+      </w:r>
+    </w:p>
+    <w:p>
+      <w:pPr>
+        <w:rPr>
+          <w:rFonts w:ascii="Times New Roman" w:eastAsiaTheme="minorEastAsia" w:hAnsi="Times New Roman" w:cs="Times New Roman"/>
+          <w:sz w:val="32"/>
+          <w:szCs w:val="32"/>
+        </w:rPr>
+      </w:pPr>
+      <w:r>
+        <w:rPr>
+          <w:rFonts w:ascii="Times New Roman" w:eastAsiaTheme="minorEastAsia" w:hAnsi="Times New Roman" w:cs="Times New Roman"/>
+          <w:sz w:val="32"/>
+          <w:szCs w:val="32"/>
+        </w:rPr>
+        <w:t xml:space="preserve">Boxplot: </w:t>
+      </w:r>
+      <w:proofErr w:type="spellStart"/>
+      <w:r>
+        <w:rPr>
+          <w:rFonts w:ascii="Times New Roman" w:eastAsiaTheme="minorEastAsia" w:hAnsi="Times New Roman" w:cs="Times New Roman"/>
+          <w:sz w:val="32"/>
+          <w:szCs w:val="32"/>
+        </w:rPr>
+        <w:t>có</w:t>
+      </w:r>
+      <w:proofErr w:type="spellEnd"/>
+      <w:r>
+        <w:rPr>
+          <w:rFonts w:ascii="Times New Roman" w:eastAsiaTheme="minorEastAsia" w:hAnsi="Times New Roman" w:cs="Times New Roman"/>
+          <w:sz w:val="32"/>
+          <w:szCs w:val="32"/>
+        </w:rPr>
+        <w:t xml:space="preserve"> </w:t>
+      </w:r>
+      <w:proofErr w:type="spellStart"/>
+      <w:r>
+        <w:rPr>
+          <w:rFonts w:ascii="Times New Roman" w:eastAsiaTheme="minorEastAsia" w:hAnsi="Times New Roman" w:cs="Times New Roman"/>
+          <w:sz w:val="32"/>
+          <w:szCs w:val="32"/>
+        </w:rPr>
+        <w:t>tác</w:t>
+      </w:r>
+      <w:proofErr w:type="spellEnd"/>
+      <w:r>
+        <w:rPr>
+          <w:rFonts w:ascii="Times New Roman" w:eastAsiaTheme="minorEastAsia" w:hAnsi="Times New Roman" w:cs="Times New Roman"/>
+          <w:sz w:val="32"/>
+          <w:szCs w:val="32"/>
+        </w:rPr>
+        <w:t xml:space="preserve"> </w:t>
+      </w:r>
+      <w:proofErr w:type="spellStart"/>
+      <w:r>
+        <w:rPr>
+          <w:rFonts w:ascii="Times New Roman" w:eastAsiaTheme="minorEastAsia" w:hAnsi="Times New Roman" w:cs="Times New Roman"/>
+          <w:sz w:val="32"/>
+          <w:szCs w:val="32"/>
+        </w:rPr>
+        <w:t>dụng</w:t>
+      </w:r>
+      <w:proofErr w:type="spellEnd"/>
+      <w:r>
+        <w:rPr>
+          <w:rFonts w:ascii="Times New Roman" w:eastAsiaTheme="minorEastAsia" w:hAnsi="Times New Roman" w:cs="Times New Roman"/>
+          <w:sz w:val="32"/>
+          <w:szCs w:val="32"/>
+        </w:rPr>
+        <w:t xml:space="preserve"> </w:t>
+      </w:r>
+      <w:proofErr w:type="spellStart"/>
+      <w:proofErr w:type="gramStart"/>
+      <w:r>
+        <w:rPr>
+          <w:rFonts w:ascii="Times New Roman" w:eastAsiaTheme="minorEastAsia" w:hAnsi="Times New Roman" w:cs="Times New Roman"/>
+          <w:sz w:val="32"/>
+          <w:szCs w:val="32"/>
+        </w:rPr>
+        <w:t>gì</w:t>
+      </w:r>
+      <w:proofErr w:type="spellEnd"/>
+      <w:r>
+        <w:rPr>
+          <w:rFonts w:ascii="Times New Roman" w:eastAsiaTheme="minorEastAsia" w:hAnsi="Times New Roman" w:cs="Times New Roman"/>
+          <w:sz w:val="32"/>
+          <w:szCs w:val="32"/>
+        </w:rPr>
+        <w:t xml:space="preserve"> ?</w:t>
+      </w:r>
+      <w:proofErr w:type="gramEnd"/>
+    </w:p>
+    <w:p>
+      <w:pPr>
+        <w:rPr>
+          <w:rFonts w:ascii="Times New Roman" w:eastAsiaTheme="minorEastAsia" w:hAnsi="Times New Roman" w:cs="Times New Roman"/>
+          <w:sz w:val="32"/>
+          <w:szCs w:val="32"/>
+        </w:rPr>
+      </w:pPr>
+      <w:r>
+        <w:rPr>
+          <w:rFonts w:ascii="Times New Roman" w:eastAsiaTheme="minorEastAsia" w:hAnsi="Times New Roman" w:cs="Times New Roman"/>
+          <w:sz w:val="32"/>
+          <w:szCs w:val="32"/>
+        </w:rPr>
+        <w:t xml:space="preserve">Residual Analysis: </w:t>
+      </w:r>
+      <w:proofErr w:type="spellStart"/>
+      <w:r>
+        <w:rPr>
+          <w:rFonts w:ascii="Times New Roman" w:eastAsiaTheme="minorEastAsia" w:hAnsi="Times New Roman" w:cs="Times New Roman"/>
+          <w:sz w:val="32"/>
+          <w:szCs w:val="32"/>
+        </w:rPr>
+        <w:t>Phân</w:t>
+      </w:r>
+      <w:proofErr w:type="spellEnd"/>
+      <w:r>
+        <w:rPr>
+          <w:rFonts w:ascii="Times New Roman" w:eastAsiaTheme="minorEastAsia" w:hAnsi="Times New Roman" w:cs="Times New Roman"/>
+          <w:sz w:val="32"/>
+          <w:szCs w:val="32"/>
+        </w:rPr>
+        <w:t xml:space="preserve"> </w:t>
+      </w:r>
+      <w:proofErr w:type="spellStart"/>
+      <w:r>
+        <w:rPr>
+          <w:rFonts w:ascii="Times New Roman" w:eastAsiaTheme="minorEastAsia" w:hAnsi="Times New Roman" w:cs="Times New Roman"/>
+          <w:sz w:val="32"/>
+          <w:szCs w:val="32"/>
+        </w:rPr>
+        <w:t>tích</w:t>
+      </w:r>
+      <w:proofErr w:type="spellEnd"/>
+      <w:r>
+        <w:rPr>
+          <w:rFonts w:ascii="Times New Roman" w:eastAsiaTheme="minorEastAsia" w:hAnsi="Times New Roman" w:cs="Times New Roman"/>
+          <w:sz w:val="32"/>
+          <w:szCs w:val="32"/>
+        </w:rPr>
+        <w:t xml:space="preserve"> </w:t>
+      </w:r>
+      <w:proofErr w:type="spellStart"/>
+      <w:r>
+        <w:rPr>
+          <w:rFonts w:ascii="Times New Roman" w:eastAsiaTheme="minorEastAsia" w:hAnsi="Times New Roman" w:cs="Times New Roman"/>
+          <w:sz w:val="32"/>
+          <w:szCs w:val="32"/>
+        </w:rPr>
+        <w:t>phần</w:t>
+      </w:r>
+      <w:proofErr w:type="spellEnd"/>
+      <w:r>
+        <w:rPr>
+          <w:rFonts w:ascii="Times New Roman" w:eastAsiaTheme="minorEastAsia" w:hAnsi="Times New Roman" w:cs="Times New Roman"/>
+          <w:sz w:val="32"/>
+          <w:szCs w:val="32"/>
+        </w:rPr>
+        <w:t xml:space="preserve"> </w:t>
+      </w:r>
+      <w:proofErr w:type="spellStart"/>
+      <w:r>
+        <w:rPr>
+          <w:rFonts w:ascii="Times New Roman" w:eastAsiaTheme="minorEastAsia" w:hAnsi="Times New Roman" w:cs="Times New Roman"/>
+          <w:sz w:val="32"/>
+          <w:szCs w:val="32"/>
+        </w:rPr>
+        <w:t>dư</w:t>
+      </w:r>
+      <w:proofErr w:type="spellEnd"/>
+      <w:r>
+        <w:rPr>
+          <w:rFonts w:ascii="Times New Roman" w:eastAsiaTheme="minorEastAsia" w:hAnsi="Times New Roman" w:cs="Times New Roman"/>
+          <w:sz w:val="32"/>
+          <w:szCs w:val="32"/>
+        </w:rPr>
+        <w:t xml:space="preserve"> -&gt; </w:t>
+      </w:r>
+      <w:proofErr w:type="spellStart"/>
+      <w:r>
+        <w:rPr>
+          <w:rFonts w:ascii="Times New Roman" w:eastAsiaTheme="minorEastAsia" w:hAnsi="Times New Roman" w:cs="Times New Roman"/>
+          <w:sz w:val="32"/>
+          <w:szCs w:val="32"/>
+        </w:rPr>
+        <w:t>Ví</w:t>
+      </w:r>
+      <w:proofErr w:type="spellEnd"/>
+      <w:r>
+        <w:rPr>
+          <w:rFonts w:ascii="Times New Roman" w:eastAsiaTheme="minorEastAsia" w:hAnsi="Times New Roman" w:cs="Times New Roman"/>
+          <w:sz w:val="32"/>
+          <w:szCs w:val="32"/>
+        </w:rPr>
+        <w:t xml:space="preserve"> </w:t>
+      </w:r>
+      <w:proofErr w:type="spellStart"/>
+      <w:r>
+        <w:rPr>
+          <w:rFonts w:ascii="Times New Roman" w:eastAsiaTheme="minorEastAsia" w:hAnsi="Times New Roman" w:cs="Times New Roman"/>
+          <w:sz w:val="32"/>
+          <w:szCs w:val="32"/>
+        </w:rPr>
+        <w:t>dụ</w:t>
+      </w:r>
+      <w:proofErr w:type="spellEnd"/>
+      <w:r>
+        <w:rPr>
+          <w:rFonts w:ascii="Times New Roman" w:eastAsiaTheme="minorEastAsia" w:hAnsi="Times New Roman" w:cs="Times New Roman"/>
+          <w:sz w:val="32"/>
+          <w:szCs w:val="32"/>
+        </w:rPr>
+        <w:t xml:space="preserve"> </w:t>
+      </w:r>
+      <w:proofErr w:type="spellStart"/>
+      <w:r>
+        <w:rPr>
+          <w:rFonts w:ascii="Times New Roman" w:eastAsiaTheme="minorEastAsia" w:hAnsi="Times New Roman" w:cs="Times New Roman"/>
+          <w:sz w:val="32"/>
+          <w:szCs w:val="32"/>
+        </w:rPr>
+        <w:t>mô</w:t>
+      </w:r>
+      <w:proofErr w:type="spellEnd"/>
+      <w:r>
+        <w:rPr>
+          <w:rFonts w:ascii="Times New Roman" w:eastAsiaTheme="minorEastAsia" w:hAnsi="Times New Roman" w:cs="Times New Roman"/>
+          <w:sz w:val="32"/>
+          <w:szCs w:val="32"/>
+        </w:rPr>
+        <w:t xml:space="preserve"> </w:t>
+      </w:r>
+      <w:proofErr w:type="spellStart"/>
+      <w:r>
+        <w:rPr>
+          <w:rFonts w:ascii="Times New Roman" w:eastAsiaTheme="minorEastAsia" w:hAnsi="Times New Roman" w:cs="Times New Roman"/>
+          <w:sz w:val="32"/>
+          <w:szCs w:val="32"/>
+        </w:rPr>
+        <w:t>hình</w:t>
+      </w:r>
+      <w:proofErr w:type="spellEnd"/>
+      <w:r>
+        <w:rPr>
+          <w:rFonts w:ascii="Times New Roman" w:eastAsiaTheme="minorEastAsia" w:hAnsi="Times New Roman" w:cs="Times New Roman"/>
+          <w:sz w:val="32"/>
+          <w:szCs w:val="32"/>
+        </w:rPr>
+        <w:t xml:space="preserve"> </w:t>
+      </w:r>
+      <w:proofErr w:type="spellStart"/>
+      <w:r>
+        <w:rPr>
+          <w:rFonts w:ascii="Times New Roman" w:eastAsiaTheme="minorEastAsia" w:hAnsi="Times New Roman" w:cs="Times New Roman"/>
+          <w:sz w:val="32"/>
+          <w:szCs w:val="32"/>
+        </w:rPr>
+        <w:t>học</w:t>
+      </w:r>
+      <w:proofErr w:type="spellEnd"/>
+      <w:r>
+        <w:rPr>
+          <w:rFonts w:ascii="Times New Roman" w:eastAsiaTheme="minorEastAsia" w:hAnsi="Times New Roman" w:cs="Times New Roman"/>
+          <w:sz w:val="32"/>
+          <w:szCs w:val="32"/>
+        </w:rPr>
+        <w:t xml:space="preserve"> </w:t>
+      </w:r>
+      <w:proofErr w:type="spellStart"/>
+      <w:r>
+        <w:rPr>
+          <w:rFonts w:ascii="Times New Roman" w:eastAsiaTheme="minorEastAsia" w:hAnsi="Times New Roman" w:cs="Times New Roman"/>
+          <w:sz w:val="32"/>
+          <w:szCs w:val="32"/>
+        </w:rPr>
+        <w:t>khoảng</w:t>
+      </w:r>
+      <w:proofErr w:type="spellEnd"/>
+      <w:r>
+        <w:rPr>
+          <w:rFonts w:ascii="Times New Roman" w:eastAsiaTheme="minorEastAsia" w:hAnsi="Times New Roman" w:cs="Times New Roman"/>
+          <w:sz w:val="32"/>
+          <w:szCs w:val="32"/>
+        </w:rPr>
+        <w:t xml:space="preserve"> [-5, 5] </w:t>
+      </w:r>
+      <w:proofErr w:type="spellStart"/>
+      <w:r>
+        <w:rPr>
+          <w:rFonts w:ascii="Times New Roman" w:eastAsiaTheme="minorEastAsia" w:hAnsi="Times New Roman" w:cs="Times New Roman"/>
+          <w:sz w:val="32"/>
+          <w:szCs w:val="32"/>
+        </w:rPr>
+        <w:t>thì</w:t>
+      </w:r>
+      <w:proofErr w:type="spellEnd"/>
+      <w:r>
+        <w:rPr>
+          <w:rFonts w:ascii="Times New Roman" w:eastAsiaTheme="minorEastAsia" w:hAnsi="Times New Roman" w:cs="Times New Roman"/>
+          <w:sz w:val="32"/>
+          <w:szCs w:val="32"/>
+        </w:rPr>
+        <w:t xml:space="preserve"> </w:t>
+      </w:r>
+      <w:proofErr w:type="spellStart"/>
+      <w:r>
+        <w:rPr>
+          <w:rFonts w:ascii="Times New Roman" w:eastAsiaTheme="minorEastAsia" w:hAnsi="Times New Roman" w:cs="Times New Roman"/>
+          <w:sz w:val="32"/>
+          <w:szCs w:val="32"/>
+        </w:rPr>
+        <w:t>cần</w:t>
+      </w:r>
+      <w:proofErr w:type="spellEnd"/>
+      <w:r>
+        <w:rPr>
+          <w:rFonts w:ascii="Times New Roman" w:eastAsiaTheme="minorEastAsia" w:hAnsi="Times New Roman" w:cs="Times New Roman"/>
+          <w:sz w:val="32"/>
+          <w:szCs w:val="32"/>
+        </w:rPr>
+        <w:t xml:space="preserve"> </w:t>
+      </w:r>
+      <w:proofErr w:type="spellStart"/>
+      <w:r>
+        <w:rPr>
+          <w:rFonts w:ascii="Times New Roman" w:eastAsiaTheme="minorEastAsia" w:hAnsi="Times New Roman" w:cs="Times New Roman"/>
+          <w:sz w:val="32"/>
+          <w:szCs w:val="32"/>
+        </w:rPr>
+        <w:t>phần</w:t>
+      </w:r>
+      <w:proofErr w:type="spellEnd"/>
+      <w:r>
+        <w:rPr>
+          <w:rFonts w:ascii="Times New Roman" w:eastAsiaTheme="minorEastAsia" w:hAnsi="Times New Roman" w:cs="Times New Roman"/>
+          <w:sz w:val="32"/>
+          <w:szCs w:val="32"/>
+        </w:rPr>
+        <w:t xml:space="preserve"> </w:t>
+      </w:r>
+      <w:proofErr w:type="spellStart"/>
+      <w:r>
+        <w:rPr>
+          <w:rFonts w:ascii="Times New Roman" w:eastAsiaTheme="minorEastAsia" w:hAnsi="Times New Roman" w:cs="Times New Roman"/>
+          <w:sz w:val="32"/>
+          <w:szCs w:val="32"/>
+        </w:rPr>
+        <w:t>tích</w:t>
+      </w:r>
+      <w:proofErr w:type="spellEnd"/>
+      <w:r>
+        <w:rPr>
+          <w:rFonts w:ascii="Times New Roman" w:eastAsiaTheme="minorEastAsia" w:hAnsi="Times New Roman" w:cs="Times New Roman"/>
+          <w:sz w:val="32"/>
+          <w:szCs w:val="32"/>
+        </w:rPr>
+        <w:t xml:space="preserve"> </w:t>
+      </w:r>
+      <w:proofErr w:type="spellStart"/>
+      <w:r>
+        <w:rPr>
+          <w:rFonts w:ascii="Times New Roman" w:eastAsiaTheme="minorEastAsia" w:hAnsi="Times New Roman" w:cs="Times New Roman"/>
+          <w:sz w:val="32"/>
+          <w:szCs w:val="32"/>
+        </w:rPr>
+        <w:t>phần</w:t>
+      </w:r>
+      <w:proofErr w:type="spellEnd"/>
+      <w:r>
+        <w:rPr>
+          <w:rFonts w:ascii="Times New Roman" w:eastAsiaTheme="minorEastAsia" w:hAnsi="Times New Roman" w:cs="Times New Roman"/>
+          <w:sz w:val="32"/>
+          <w:szCs w:val="32"/>
+        </w:rPr>
+        <w:t xml:space="preserve"> </w:t>
+      </w:r>
+      <w:proofErr w:type="spellStart"/>
+      <w:r>
+        <w:rPr>
+          <w:rFonts w:ascii="Times New Roman" w:eastAsiaTheme="minorEastAsia" w:hAnsi="Times New Roman" w:cs="Times New Roman"/>
+          <w:sz w:val="32"/>
+          <w:szCs w:val="32"/>
+        </w:rPr>
+        <w:t>ngoài</w:t>
+      </w:r>
+      <w:proofErr w:type="spellEnd"/>
+    </w:p>
+    <w:p>
+      <w:pPr>
+        <w:rPr>
+          <w:rFonts w:ascii="Times New Roman" w:eastAsiaTheme="minorEastAsia" w:hAnsi="Times New Roman" w:cs="Times New Roman"/>
+          <w:sz w:val="32"/>
+          <w:szCs w:val="32"/>
+        </w:rPr>
+      </w:pPr>
+    </w:p>
+    <w:p>
+      <w:pPr>
+        <w:rPr>
+          <w:rFonts w:ascii="Times New Roman" w:eastAsiaTheme="minorEastAsia" w:hAnsi="Times New Roman" w:cs="Times New Roman"/>
+          <w:sz w:val="32"/>
+          <w:szCs w:val="32"/>
+        </w:rPr>
+      </w:pPr>
+      <w:proofErr w:type="spellStart"/>
+      <w:r>
+        <w:rPr>
+          <w:rFonts w:ascii="Times New Roman" w:eastAsiaTheme="minorEastAsia" w:hAnsi="Times New Roman" w:cs="Times New Roman"/>
+          <w:sz w:val="32"/>
+          <w:szCs w:val="32"/>
+        </w:rPr>
+        <w:t>Để</w:t>
+      </w:r>
+      <w:proofErr w:type="spellEnd"/>
+      <w:r>
+        <w:rPr>
+          <w:rFonts w:ascii="Times New Roman" w:eastAsiaTheme="minorEastAsia" w:hAnsi="Times New Roman" w:cs="Times New Roman"/>
+          <w:sz w:val="32"/>
+          <w:szCs w:val="32"/>
+        </w:rPr>
+        <w:t xml:space="preserve"> </w:t>
+      </w:r>
+      <w:proofErr w:type="spellStart"/>
+      <w:r>
+        <w:rPr>
+          <w:rFonts w:ascii="Times New Roman" w:eastAsiaTheme="minorEastAsia" w:hAnsi="Times New Roman" w:cs="Times New Roman"/>
+          <w:sz w:val="32"/>
+          <w:szCs w:val="32"/>
+        </w:rPr>
+        <w:t>mô</w:t>
+      </w:r>
+      <w:proofErr w:type="spellEnd"/>
+      <w:r>
+        <w:rPr>
+          <w:rFonts w:ascii="Times New Roman" w:eastAsiaTheme="minorEastAsia" w:hAnsi="Times New Roman" w:cs="Times New Roman"/>
+          <w:sz w:val="32"/>
+          <w:szCs w:val="32"/>
+        </w:rPr>
+        <w:t xml:space="preserve"> </w:t>
+      </w:r>
+      <w:proofErr w:type="spellStart"/>
+      <w:r>
+        <w:rPr>
+          <w:rFonts w:ascii="Times New Roman" w:eastAsiaTheme="minorEastAsia" w:hAnsi="Times New Roman" w:cs="Times New Roman"/>
+          <w:sz w:val="32"/>
+          <w:szCs w:val="32"/>
+        </w:rPr>
+        <w:t>hình</w:t>
+      </w:r>
+      <w:proofErr w:type="spellEnd"/>
+      <w:r>
+        <w:rPr>
+          <w:rFonts w:ascii="Times New Roman" w:eastAsiaTheme="minorEastAsia" w:hAnsi="Times New Roman" w:cs="Times New Roman"/>
+          <w:sz w:val="32"/>
+          <w:szCs w:val="32"/>
+        </w:rPr>
+        <w:t xml:space="preserve"> AR </w:t>
+      </w:r>
+      <w:proofErr w:type="spellStart"/>
+      <w:r>
+        <w:rPr>
+          <w:rFonts w:ascii="Times New Roman" w:eastAsiaTheme="minorEastAsia" w:hAnsi="Times New Roman" w:cs="Times New Roman"/>
+          <w:sz w:val="32"/>
+          <w:szCs w:val="32"/>
+        </w:rPr>
+        <w:t>hoạt</w:t>
+      </w:r>
+      <w:proofErr w:type="spellEnd"/>
+      <w:r>
+        <w:rPr>
+          <w:rFonts w:ascii="Times New Roman" w:eastAsiaTheme="minorEastAsia" w:hAnsi="Times New Roman" w:cs="Times New Roman"/>
+          <w:sz w:val="32"/>
+          <w:szCs w:val="32"/>
+        </w:rPr>
+        <w:t xml:space="preserve"> </w:t>
+      </w:r>
+      <w:proofErr w:type="spellStart"/>
+      <w:r>
+        <w:rPr>
+          <w:rFonts w:ascii="Times New Roman" w:eastAsiaTheme="minorEastAsia" w:hAnsi="Times New Roman" w:cs="Times New Roman"/>
+          <w:sz w:val="32"/>
+          <w:szCs w:val="32"/>
+        </w:rPr>
+        <w:t>động</w:t>
+      </w:r>
+      <w:proofErr w:type="spellEnd"/>
+      <w:r>
+        <w:rPr>
+          <w:rFonts w:ascii="Times New Roman" w:eastAsiaTheme="minorEastAsia" w:hAnsi="Times New Roman" w:cs="Times New Roman"/>
+          <w:sz w:val="32"/>
+          <w:szCs w:val="32"/>
+        </w:rPr>
+        <w:t xml:space="preserve"> </w:t>
+      </w:r>
+      <w:proofErr w:type="spellStart"/>
+      <w:r>
+        <w:rPr>
+          <w:rFonts w:ascii="Times New Roman" w:eastAsiaTheme="minorEastAsia" w:hAnsi="Times New Roman" w:cs="Times New Roman"/>
+          <w:sz w:val="32"/>
+          <w:szCs w:val="32"/>
+        </w:rPr>
+        <w:t>phải</w:t>
+      </w:r>
+      <w:proofErr w:type="spellEnd"/>
+      <w:r>
+        <w:rPr>
+          <w:rFonts w:ascii="Times New Roman" w:eastAsiaTheme="minorEastAsia" w:hAnsi="Times New Roman" w:cs="Times New Roman"/>
+          <w:sz w:val="32"/>
+          <w:szCs w:val="32"/>
+        </w:rPr>
+        <w:t xml:space="preserve"> </w:t>
+      </w:r>
+      <w:proofErr w:type="spellStart"/>
+      <w:r>
+        <w:rPr>
+          <w:rFonts w:ascii="Times New Roman" w:eastAsiaTheme="minorEastAsia" w:hAnsi="Times New Roman" w:cs="Times New Roman"/>
+          <w:sz w:val="32"/>
+          <w:szCs w:val="32"/>
+        </w:rPr>
+        <w:t>có</w:t>
+      </w:r>
+      <w:proofErr w:type="spellEnd"/>
+      <w:r>
+        <w:rPr>
+          <w:rFonts w:ascii="Times New Roman" w:eastAsiaTheme="minorEastAsia" w:hAnsi="Times New Roman" w:cs="Times New Roman"/>
+          <w:sz w:val="32"/>
+          <w:szCs w:val="32"/>
+        </w:rPr>
+        <w:t xml:space="preserve"> </w:t>
+      </w:r>
+      <w:proofErr w:type="spellStart"/>
+      <w:r>
+        <w:rPr>
+          <w:rFonts w:ascii="Times New Roman" w:eastAsiaTheme="minorEastAsia" w:hAnsi="Times New Roman" w:cs="Times New Roman"/>
+          <w:sz w:val="32"/>
+          <w:szCs w:val="32"/>
+        </w:rPr>
+        <w:t>tính</w:t>
+      </w:r>
+      <w:proofErr w:type="spellEnd"/>
+      <w:r>
+        <w:rPr>
+          <w:rFonts w:ascii="Times New Roman" w:eastAsiaTheme="minorEastAsia" w:hAnsi="Times New Roman" w:cs="Times New Roman"/>
+          <w:sz w:val="32"/>
+          <w:szCs w:val="32"/>
+        </w:rPr>
+        <w:t xml:space="preserve"> </w:t>
+      </w:r>
+      <w:proofErr w:type="spellStart"/>
+      <w:r>
+        <w:rPr>
+          <w:rFonts w:ascii="Times New Roman" w:eastAsiaTheme="minorEastAsia" w:hAnsi="Times New Roman" w:cs="Times New Roman"/>
+          <w:sz w:val="32"/>
+          <w:szCs w:val="32"/>
+        </w:rPr>
+        <w:t>dừng</w:t>
+      </w:r>
+      <w:proofErr w:type="spellEnd"/>
+    </w:p>
+    <w:p>
+      <w:pPr>
+        <w:rPr>
+          <w:rFonts w:ascii="Times New Roman" w:eastAsiaTheme="minorEastAsia" w:hAnsi="Times New Roman" w:cs="Times New Roman"/>
+          <w:sz w:val="32"/>
+          <w:szCs w:val="32"/>
+        </w:rPr>
+      </w:pPr>
+      <w:proofErr w:type="spellStart"/>
+      <w:r>
+        <w:rPr>
+          <w:rFonts w:ascii="Times New Roman" w:eastAsiaTheme="minorEastAsia" w:hAnsi="Times New Roman" w:cs="Times New Roman"/>
+          <w:sz w:val="32"/>
+          <w:szCs w:val="32"/>
+        </w:rPr>
+        <w:t>Xác</w:t>
+      </w:r>
+      <w:proofErr w:type="spellEnd"/>
+      <w:r>
+        <w:rPr>
+          <w:rFonts w:ascii="Times New Roman" w:eastAsiaTheme="minorEastAsia" w:hAnsi="Times New Roman" w:cs="Times New Roman"/>
+          <w:sz w:val="32"/>
+          <w:szCs w:val="32"/>
+        </w:rPr>
+        <w:t xml:space="preserve"> </w:t>
+      </w:r>
+      <w:proofErr w:type="spellStart"/>
+      <w:r>
+        <w:rPr>
+          <w:rFonts w:ascii="Times New Roman" w:eastAsiaTheme="minorEastAsia" w:hAnsi="Times New Roman" w:cs="Times New Roman"/>
+          <w:sz w:val="32"/>
+          <w:szCs w:val="32"/>
+        </w:rPr>
+        <w:t>định</w:t>
+      </w:r>
+      <w:proofErr w:type="spellEnd"/>
+      <w:r>
+        <w:rPr>
+          <w:rFonts w:ascii="Times New Roman" w:eastAsiaTheme="minorEastAsia" w:hAnsi="Times New Roman" w:cs="Times New Roman"/>
+          <w:sz w:val="32"/>
+          <w:szCs w:val="32"/>
+        </w:rPr>
+        <w:t xml:space="preserve"> </w:t>
+      </w:r>
+      <w:proofErr w:type="spellStart"/>
+      <w:r>
+        <w:rPr>
+          <w:rFonts w:ascii="Times New Roman" w:eastAsiaTheme="minorEastAsia" w:hAnsi="Times New Roman" w:cs="Times New Roman"/>
+          <w:sz w:val="32"/>
+          <w:szCs w:val="32"/>
+        </w:rPr>
+        <w:t>bậc</w:t>
+      </w:r>
+      <w:proofErr w:type="spellEnd"/>
+      <w:r>
+        <w:rPr>
+          <w:rFonts w:ascii="Times New Roman" w:eastAsiaTheme="minorEastAsia" w:hAnsi="Times New Roman" w:cs="Times New Roman"/>
+          <w:sz w:val="32"/>
+          <w:szCs w:val="32"/>
+        </w:rPr>
+        <w:t xml:space="preserve">: PACF </w:t>
+      </w:r>
+      <w:proofErr w:type="spellStart"/>
+      <w:r>
+        <w:rPr>
+          <w:rFonts w:ascii="Times New Roman" w:eastAsiaTheme="minorEastAsia" w:hAnsi="Times New Roman" w:cs="Times New Roman"/>
+          <w:sz w:val="32"/>
+          <w:szCs w:val="32"/>
+        </w:rPr>
+        <w:t>xác</w:t>
+      </w:r>
+      <w:proofErr w:type="spellEnd"/>
+      <w:r>
+        <w:rPr>
+          <w:rFonts w:ascii="Times New Roman" w:eastAsiaTheme="minorEastAsia" w:hAnsi="Times New Roman" w:cs="Times New Roman"/>
+          <w:sz w:val="32"/>
+          <w:szCs w:val="32"/>
+        </w:rPr>
+        <w:t xml:space="preserve"> </w:t>
+      </w:r>
+      <w:proofErr w:type="spellStart"/>
+      <w:r>
+        <w:rPr>
+          <w:rFonts w:ascii="Times New Roman" w:eastAsiaTheme="minorEastAsia" w:hAnsi="Times New Roman" w:cs="Times New Roman"/>
+          <w:sz w:val="32"/>
+          <w:szCs w:val="32"/>
+        </w:rPr>
+        <w:t>định</w:t>
+      </w:r>
+      <w:proofErr w:type="spellEnd"/>
+      <w:r>
+        <w:rPr>
+          <w:rFonts w:ascii="Times New Roman" w:eastAsiaTheme="minorEastAsia" w:hAnsi="Times New Roman" w:cs="Times New Roman"/>
+          <w:sz w:val="32"/>
+          <w:szCs w:val="32"/>
+        </w:rPr>
+        <w:t xml:space="preserve"> </w:t>
+      </w:r>
+      <w:proofErr w:type="spellStart"/>
+      <w:r>
+        <w:rPr>
+          <w:rFonts w:ascii="Times New Roman" w:eastAsiaTheme="minorEastAsia" w:hAnsi="Times New Roman" w:cs="Times New Roman"/>
+          <w:sz w:val="32"/>
+          <w:szCs w:val="32"/>
+        </w:rPr>
+        <w:t>độ</w:t>
+      </w:r>
+      <w:proofErr w:type="spellEnd"/>
+      <w:r>
+        <w:rPr>
+          <w:rFonts w:ascii="Times New Roman" w:eastAsiaTheme="minorEastAsia" w:hAnsi="Times New Roman" w:cs="Times New Roman"/>
+          <w:sz w:val="32"/>
+          <w:szCs w:val="32"/>
+        </w:rPr>
+        <w:t xml:space="preserve"> </w:t>
+      </w:r>
+      <w:proofErr w:type="spellStart"/>
+      <w:r>
+        <w:rPr>
+          <w:rFonts w:ascii="Times New Roman" w:eastAsiaTheme="minorEastAsia" w:hAnsi="Times New Roman" w:cs="Times New Roman"/>
+          <w:sz w:val="32"/>
+          <w:szCs w:val="32"/>
+        </w:rPr>
+        <w:t>trễ</w:t>
+      </w:r>
+      <w:proofErr w:type="spellEnd"/>
+      <w:r>
+        <w:rPr>
+          <w:rFonts w:ascii="Times New Roman" w:eastAsiaTheme="minorEastAsia" w:hAnsi="Times New Roman" w:cs="Times New Roman"/>
+          <w:sz w:val="32"/>
+          <w:szCs w:val="32"/>
+        </w:rPr>
+        <w:t xml:space="preserve"> </w:t>
+      </w:r>
+      <w:proofErr w:type="spellStart"/>
+      <w:r>
+        <w:rPr>
+          <w:rFonts w:ascii="Times New Roman" w:eastAsiaTheme="minorEastAsia" w:hAnsi="Times New Roman" w:cs="Times New Roman"/>
+          <w:sz w:val="32"/>
+          <w:szCs w:val="32"/>
+        </w:rPr>
+        <w:t>phù</w:t>
+      </w:r>
+      <w:proofErr w:type="spellEnd"/>
+      <w:r>
+        <w:rPr>
+          <w:rFonts w:ascii="Times New Roman" w:eastAsiaTheme="minorEastAsia" w:hAnsi="Times New Roman" w:cs="Times New Roman"/>
+          <w:sz w:val="32"/>
+          <w:szCs w:val="32"/>
+        </w:rPr>
+        <w:t xml:space="preserve"> </w:t>
+      </w:r>
+      <w:proofErr w:type="spellStart"/>
+      <w:r>
+        <w:rPr>
+          <w:rFonts w:ascii="Times New Roman" w:eastAsiaTheme="minorEastAsia" w:hAnsi="Times New Roman" w:cs="Times New Roman"/>
+          <w:sz w:val="32"/>
+          <w:szCs w:val="32"/>
+        </w:rPr>
+        <w:t>hợp</w:t>
+      </w:r>
+      <w:proofErr w:type="spellEnd"/>
+      <w:r>
+        <w:rPr>
+          <w:rFonts w:ascii="Times New Roman" w:eastAsiaTheme="minorEastAsia" w:hAnsi="Times New Roman" w:cs="Times New Roman"/>
+          <w:sz w:val="32"/>
+          <w:szCs w:val="32"/>
+        </w:rPr>
+        <w:t xml:space="preserve">. </w:t>
+      </w:r>
+      <w:proofErr w:type="spellStart"/>
+      <w:r>
+        <w:rPr>
+          <w:rFonts w:ascii="Times New Roman" w:eastAsiaTheme="minorEastAsia" w:hAnsi="Times New Roman" w:cs="Times New Roman"/>
+          <w:sz w:val="32"/>
+          <w:szCs w:val="32"/>
+        </w:rPr>
+        <w:t>Nếu</w:t>
+      </w:r>
+      <w:proofErr w:type="spellEnd"/>
+      <w:r>
+        <w:rPr>
+          <w:rFonts w:ascii="Times New Roman" w:eastAsiaTheme="minorEastAsia" w:hAnsi="Times New Roman" w:cs="Times New Roman"/>
+          <w:sz w:val="32"/>
+          <w:szCs w:val="32"/>
+        </w:rPr>
+        <w:t xml:space="preserve"> PACF </w:t>
+      </w:r>
+      <w:proofErr w:type="spellStart"/>
+      <w:r>
+        <w:rPr>
+          <w:rFonts w:ascii="Times New Roman" w:eastAsiaTheme="minorEastAsia" w:hAnsi="Times New Roman" w:cs="Times New Roman"/>
+          <w:sz w:val="32"/>
+          <w:szCs w:val="32"/>
+        </w:rPr>
+        <w:t>bị</w:t>
+      </w:r>
+      <w:proofErr w:type="spellEnd"/>
+      <w:r>
+        <w:rPr>
+          <w:rFonts w:ascii="Times New Roman" w:eastAsiaTheme="minorEastAsia" w:hAnsi="Times New Roman" w:cs="Times New Roman"/>
+          <w:sz w:val="32"/>
+          <w:szCs w:val="32"/>
+        </w:rPr>
+        <w:t xml:space="preserve"> </w:t>
+      </w:r>
+      <w:proofErr w:type="spellStart"/>
+      <w:r>
+        <w:rPr>
+          <w:rFonts w:ascii="Times New Roman" w:eastAsiaTheme="minorEastAsia" w:hAnsi="Times New Roman" w:cs="Times New Roman"/>
+          <w:sz w:val="32"/>
+          <w:szCs w:val="32"/>
+        </w:rPr>
+        <w:t>triệt</w:t>
+      </w:r>
+      <w:proofErr w:type="spellEnd"/>
+      <w:r>
+        <w:rPr>
+          <w:rFonts w:ascii="Times New Roman" w:eastAsiaTheme="minorEastAsia" w:hAnsi="Times New Roman" w:cs="Times New Roman"/>
+          <w:sz w:val="32"/>
+          <w:szCs w:val="32"/>
+        </w:rPr>
+        <w:t xml:space="preserve"> </w:t>
+      </w:r>
+      <w:proofErr w:type="spellStart"/>
+      <w:r>
+        <w:rPr>
+          <w:rFonts w:ascii="Times New Roman" w:eastAsiaTheme="minorEastAsia" w:hAnsi="Times New Roman" w:cs="Times New Roman"/>
+          <w:sz w:val="32"/>
+          <w:szCs w:val="32"/>
+        </w:rPr>
+        <w:t>tiêu</w:t>
+      </w:r>
+      <w:proofErr w:type="spellEnd"/>
+      <w:r>
+        <w:rPr>
+          <w:rFonts w:ascii="Times New Roman" w:eastAsiaTheme="minorEastAsia" w:hAnsi="Times New Roman" w:cs="Times New Roman"/>
+          <w:sz w:val="32"/>
+          <w:szCs w:val="32"/>
+        </w:rPr>
+        <w:t xml:space="preserve"> </w:t>
+      </w:r>
+      <w:proofErr w:type="spellStart"/>
+      <w:r>
+        <w:rPr>
+          <w:rFonts w:ascii="Times New Roman" w:eastAsiaTheme="minorEastAsia" w:hAnsi="Times New Roman" w:cs="Times New Roman"/>
+          <w:sz w:val="32"/>
+          <w:szCs w:val="32"/>
+        </w:rPr>
+        <w:t>sau</w:t>
+      </w:r>
+      <w:proofErr w:type="spellEnd"/>
+      <w:r>
+        <w:rPr>
+          <w:rFonts w:ascii="Times New Roman" w:eastAsiaTheme="minorEastAsia" w:hAnsi="Times New Roman" w:cs="Times New Roman"/>
+          <w:sz w:val="32"/>
+          <w:szCs w:val="32"/>
+        </w:rPr>
+        <w:t xml:space="preserve"> </w:t>
+      </w:r>
+      <w:proofErr w:type="spellStart"/>
+      <w:r>
+        <w:rPr>
+          <w:rFonts w:ascii="Times New Roman" w:eastAsiaTheme="minorEastAsia" w:hAnsi="Times New Roman" w:cs="Times New Roman"/>
+          <w:sz w:val="32"/>
+          <w:szCs w:val="32"/>
+        </w:rPr>
+        <w:t>độ</w:t>
+      </w:r>
+      <w:proofErr w:type="spellEnd"/>
+      <w:r>
+        <w:rPr>
+          <w:rFonts w:ascii="Times New Roman" w:eastAsiaTheme="minorEastAsia" w:hAnsi="Times New Roman" w:cs="Times New Roman"/>
+          <w:sz w:val="32"/>
+          <w:szCs w:val="32"/>
+        </w:rPr>
+        <w:t xml:space="preserve"> </w:t>
+      </w:r>
+      <w:proofErr w:type="spellStart"/>
+      <w:r>
+        <w:rPr>
+          <w:rFonts w:ascii="Times New Roman" w:eastAsiaTheme="minorEastAsia" w:hAnsi="Times New Roman" w:cs="Times New Roman"/>
+          <w:sz w:val="32"/>
+          <w:szCs w:val="32"/>
+        </w:rPr>
+        <w:t>trễ</w:t>
+      </w:r>
+      <w:proofErr w:type="spellEnd"/>
+      <w:r>
+        <w:rPr>
+          <w:rFonts w:ascii="Times New Roman" w:eastAsiaTheme="minorEastAsia" w:hAnsi="Times New Roman" w:cs="Times New Roman"/>
+          <w:sz w:val="32"/>
+          <w:szCs w:val="32"/>
+        </w:rPr>
+        <w:t xml:space="preserve"> </w:t>
+      </w:r>
+      <w:proofErr w:type="spellStart"/>
+      <w:r>
+        <w:rPr>
+          <w:rFonts w:ascii="Times New Roman" w:eastAsiaTheme="minorEastAsia" w:hAnsi="Times New Roman" w:cs="Times New Roman"/>
+          <w:sz w:val="32"/>
+          <w:szCs w:val="32"/>
+        </w:rPr>
+        <w:t>thì</w:t>
+      </w:r>
+      <w:proofErr w:type="spellEnd"/>
+      <w:r>
+        <w:rPr>
+          <w:rFonts w:ascii="Times New Roman" w:eastAsiaTheme="minorEastAsia" w:hAnsi="Times New Roman" w:cs="Times New Roman"/>
+          <w:sz w:val="32"/>
+          <w:szCs w:val="32"/>
+        </w:rPr>
+        <w:t xml:space="preserve"> </w:t>
+      </w:r>
+      <w:proofErr w:type="spellStart"/>
+      <w:r>
+        <w:rPr>
+          <w:rFonts w:ascii="Times New Roman" w:eastAsiaTheme="minorEastAsia" w:hAnsi="Times New Roman" w:cs="Times New Roman"/>
+          <w:sz w:val="32"/>
+          <w:szCs w:val="32"/>
+        </w:rPr>
+        <w:t>dấu</w:t>
+      </w:r>
+      <w:proofErr w:type="spellEnd"/>
+      <w:r>
+        <w:rPr>
+          <w:rFonts w:ascii="Times New Roman" w:eastAsiaTheme="minorEastAsia" w:hAnsi="Times New Roman" w:cs="Times New Roman"/>
+          <w:sz w:val="32"/>
+          <w:szCs w:val="32"/>
+        </w:rPr>
+        <w:t xml:space="preserve"> </w:t>
+      </w:r>
+      <w:proofErr w:type="spellStart"/>
+      <w:r>
+        <w:rPr>
+          <w:rFonts w:ascii="Times New Roman" w:eastAsiaTheme="minorEastAsia" w:hAnsi="Times New Roman" w:cs="Times New Roman"/>
+          <w:sz w:val="32"/>
+          <w:szCs w:val="32"/>
+        </w:rPr>
+        <w:t>hiệu</w:t>
+      </w:r>
+      <w:proofErr w:type="spellEnd"/>
+      <w:r>
+        <w:rPr>
+          <w:rFonts w:ascii="Times New Roman" w:eastAsiaTheme="minorEastAsia" w:hAnsi="Times New Roman" w:cs="Times New Roman"/>
+          <w:sz w:val="32"/>
+          <w:szCs w:val="32"/>
+        </w:rPr>
+        <w:t xml:space="preserve"> </w:t>
+      </w:r>
+      <w:proofErr w:type="spellStart"/>
+      <w:r>
+        <w:rPr>
+          <w:rFonts w:ascii="Times New Roman" w:eastAsiaTheme="minorEastAsia" w:hAnsi="Times New Roman" w:cs="Times New Roman"/>
+          <w:sz w:val="32"/>
+          <w:szCs w:val="32"/>
+        </w:rPr>
+        <w:t>mô</w:t>
+      </w:r>
+      <w:proofErr w:type="spellEnd"/>
+      <w:r>
+        <w:rPr>
+          <w:rFonts w:ascii="Times New Roman" w:eastAsiaTheme="minorEastAsia" w:hAnsi="Times New Roman" w:cs="Times New Roman"/>
+          <w:sz w:val="32"/>
+          <w:szCs w:val="32"/>
+        </w:rPr>
+        <w:t xml:space="preserve"> </w:t>
+      </w:r>
+      <w:proofErr w:type="spellStart"/>
+      <w:r>
+        <w:rPr>
+          <w:rFonts w:ascii="Times New Roman" w:eastAsiaTheme="minorEastAsia" w:hAnsi="Times New Roman" w:cs="Times New Roman"/>
+          <w:sz w:val="32"/>
+          <w:szCs w:val="32"/>
+        </w:rPr>
+        <w:t>hình</w:t>
+      </w:r>
+      <w:proofErr w:type="spellEnd"/>
+      <w:r>
+        <w:rPr>
+          <w:rFonts w:ascii="Times New Roman" w:eastAsiaTheme="minorEastAsia" w:hAnsi="Times New Roman" w:cs="Times New Roman"/>
+          <w:sz w:val="32"/>
+          <w:szCs w:val="32"/>
+        </w:rPr>
+        <w:t xml:space="preserve"> AR</w:t>
+      </w:r>
+    </w:p>
+    <w:p>
+      <w:pPr>
+        <w:rPr>
+          <w:rFonts w:ascii="Times New Roman" w:eastAsiaTheme="minorEastAsia" w:hAnsi="Times New Roman" w:cs="Times New Roman"/>
+          <w:sz w:val="32"/>
+          <w:szCs w:val="32"/>
+        </w:rPr>
+      </w:pPr>
+      <w:proofErr w:type="spellStart"/>
+      <w:r>
+        <w:rPr>
+          <w:rFonts w:ascii="Times New Roman" w:eastAsiaTheme="minorEastAsia" w:hAnsi="Times New Roman" w:cs="Times New Roman"/>
+          <w:sz w:val="32"/>
+          <w:szCs w:val="32"/>
+        </w:rPr>
+        <w:t>Mối</w:t>
+      </w:r>
+      <w:proofErr w:type="spellEnd"/>
+      <w:r>
+        <w:rPr>
+          <w:rFonts w:ascii="Times New Roman" w:eastAsiaTheme="minorEastAsia" w:hAnsi="Times New Roman" w:cs="Times New Roman"/>
+          <w:sz w:val="32"/>
+          <w:szCs w:val="32"/>
+        </w:rPr>
+        <w:t xml:space="preserve"> </w:t>
+      </w:r>
+      <w:proofErr w:type="spellStart"/>
+      <w:r>
+        <w:rPr>
+          <w:rFonts w:ascii="Times New Roman" w:eastAsiaTheme="minorEastAsia" w:hAnsi="Times New Roman" w:cs="Times New Roman"/>
+          <w:sz w:val="32"/>
+          <w:szCs w:val="32"/>
+        </w:rPr>
+        <w:t>quan</w:t>
+      </w:r>
+      <w:proofErr w:type="spellEnd"/>
+      <w:r>
+        <w:rPr>
+          <w:rFonts w:ascii="Times New Roman" w:eastAsiaTheme="minorEastAsia" w:hAnsi="Times New Roman" w:cs="Times New Roman"/>
+          <w:sz w:val="32"/>
+          <w:szCs w:val="32"/>
+        </w:rPr>
+        <w:t xml:space="preserve"> </w:t>
+      </w:r>
+      <w:proofErr w:type="spellStart"/>
+      <w:r>
+        <w:rPr>
+          <w:rFonts w:ascii="Times New Roman" w:eastAsiaTheme="minorEastAsia" w:hAnsi="Times New Roman" w:cs="Times New Roman"/>
+          <w:sz w:val="32"/>
+          <w:szCs w:val="32"/>
+        </w:rPr>
+        <w:t>hệ</w:t>
+      </w:r>
+      <w:proofErr w:type="spellEnd"/>
+      <w:r>
+        <w:rPr>
+          <w:rFonts w:ascii="Times New Roman" w:eastAsiaTheme="minorEastAsia" w:hAnsi="Times New Roman" w:cs="Times New Roman"/>
+          <w:sz w:val="32"/>
+          <w:szCs w:val="32"/>
+        </w:rPr>
+        <w:t>: Phi(</w:t>
+      </w:r>
+      <w:proofErr w:type="spellStart"/>
+      <w:r>
+        <w:rPr>
+          <w:rFonts w:ascii="Times New Roman" w:eastAsiaTheme="minorEastAsia" w:hAnsi="Times New Roman" w:cs="Times New Roman"/>
+          <w:sz w:val="32"/>
+          <w:szCs w:val="32"/>
+        </w:rPr>
+        <w:t>i</w:t>
+      </w:r>
+      <w:proofErr w:type="spellEnd"/>
+      <w:r>
+        <w:rPr>
+          <w:rFonts w:ascii="Times New Roman" w:eastAsiaTheme="minorEastAsia" w:hAnsi="Times New Roman" w:cs="Times New Roman"/>
+          <w:sz w:val="32"/>
+          <w:szCs w:val="32"/>
+        </w:rPr>
+        <w:t xml:space="preserve">) </w:t>
+      </w:r>
+      <w:proofErr w:type="spellStart"/>
+      <w:r>
+        <w:rPr>
+          <w:rFonts w:ascii="Times New Roman" w:eastAsiaTheme="minorEastAsia" w:hAnsi="Times New Roman" w:cs="Times New Roman"/>
+          <w:sz w:val="32"/>
+          <w:szCs w:val="32"/>
+        </w:rPr>
+        <w:t>gần</w:t>
+      </w:r>
+      <w:proofErr w:type="spellEnd"/>
+      <w:r>
+        <w:rPr>
+          <w:rFonts w:ascii="Times New Roman" w:eastAsiaTheme="minorEastAsia" w:hAnsi="Times New Roman" w:cs="Times New Roman"/>
+          <w:sz w:val="32"/>
+          <w:szCs w:val="32"/>
+        </w:rPr>
+        <w:t xml:space="preserve"> = 1, xu </w:t>
+      </w:r>
+      <w:proofErr w:type="spellStart"/>
+      <w:r>
+        <w:rPr>
+          <w:rFonts w:ascii="Times New Roman" w:eastAsiaTheme="minorEastAsia" w:hAnsi="Times New Roman" w:cs="Times New Roman"/>
+          <w:sz w:val="32"/>
+          <w:szCs w:val="32"/>
+        </w:rPr>
+        <w:t>hướng</w:t>
+      </w:r>
+      <w:proofErr w:type="spellEnd"/>
+      <w:r>
+        <w:rPr>
+          <w:rFonts w:ascii="Times New Roman" w:eastAsiaTheme="minorEastAsia" w:hAnsi="Times New Roman" w:cs="Times New Roman"/>
+          <w:sz w:val="32"/>
+          <w:szCs w:val="32"/>
+        </w:rPr>
+        <w:t xml:space="preserve"> </w:t>
+      </w:r>
+      <w:proofErr w:type="spellStart"/>
+      <w:r>
+        <w:rPr>
+          <w:rFonts w:ascii="Times New Roman" w:eastAsiaTheme="minorEastAsia" w:hAnsi="Times New Roman" w:cs="Times New Roman"/>
+          <w:sz w:val="32"/>
+          <w:szCs w:val="32"/>
+        </w:rPr>
+        <w:t>duy</w:t>
+      </w:r>
+      <w:proofErr w:type="spellEnd"/>
+      <w:r>
+        <w:rPr>
+          <w:rFonts w:ascii="Times New Roman" w:eastAsiaTheme="minorEastAsia" w:hAnsi="Times New Roman" w:cs="Times New Roman"/>
+          <w:sz w:val="32"/>
+          <w:szCs w:val="32"/>
+        </w:rPr>
+        <w:t xml:space="preserve"> </w:t>
+      </w:r>
+      <w:proofErr w:type="spellStart"/>
+      <w:r>
+        <w:rPr>
+          <w:rFonts w:ascii="Times New Roman" w:eastAsiaTheme="minorEastAsia" w:hAnsi="Times New Roman" w:cs="Times New Roman"/>
+          <w:sz w:val="32"/>
+          <w:szCs w:val="32"/>
+        </w:rPr>
+        <w:t>trì</w:t>
+      </w:r>
+      <w:proofErr w:type="spellEnd"/>
+      <w:r>
+        <w:rPr>
+          <w:rFonts w:ascii="Times New Roman" w:eastAsiaTheme="minorEastAsia" w:hAnsi="Times New Roman" w:cs="Times New Roman"/>
+          <w:sz w:val="32"/>
+          <w:szCs w:val="32"/>
+        </w:rPr>
+        <w:t xml:space="preserve"> </w:t>
+      </w:r>
+      <w:proofErr w:type="spellStart"/>
+      <w:r>
+        <w:rPr>
+          <w:rFonts w:ascii="Times New Roman" w:eastAsiaTheme="minorEastAsia" w:hAnsi="Times New Roman" w:cs="Times New Roman"/>
+          <w:sz w:val="32"/>
+          <w:szCs w:val="32"/>
+        </w:rPr>
+        <w:t>giá</w:t>
+      </w:r>
+      <w:proofErr w:type="spellEnd"/>
+      <w:r>
+        <w:rPr>
+          <w:rFonts w:ascii="Times New Roman" w:eastAsiaTheme="minorEastAsia" w:hAnsi="Times New Roman" w:cs="Times New Roman"/>
+          <w:sz w:val="32"/>
+          <w:szCs w:val="32"/>
+        </w:rPr>
+        <w:t xml:space="preserve"> </w:t>
+      </w:r>
+      <w:proofErr w:type="spellStart"/>
+      <w:r>
+        <w:rPr>
+          <w:rFonts w:ascii="Times New Roman" w:eastAsiaTheme="minorEastAsia" w:hAnsi="Times New Roman" w:cs="Times New Roman"/>
+          <w:sz w:val="32"/>
+          <w:szCs w:val="32"/>
+        </w:rPr>
+        <w:t>trị</w:t>
+      </w:r>
+      <w:proofErr w:type="spellEnd"/>
+      <w:r>
+        <w:rPr>
+          <w:rFonts w:ascii="Times New Roman" w:eastAsiaTheme="minorEastAsia" w:hAnsi="Times New Roman" w:cs="Times New Roman"/>
+          <w:sz w:val="32"/>
+          <w:szCs w:val="32"/>
+        </w:rPr>
+        <w:t xml:space="preserve"> </w:t>
+      </w:r>
+      <w:proofErr w:type="spellStart"/>
+      <w:r>
+        <w:rPr>
+          <w:rFonts w:ascii="Times New Roman" w:eastAsiaTheme="minorEastAsia" w:hAnsi="Times New Roman" w:cs="Times New Roman"/>
+          <w:sz w:val="32"/>
+          <w:szCs w:val="32"/>
+        </w:rPr>
+        <w:t>hiện</w:t>
+      </w:r>
+      <w:proofErr w:type="spellEnd"/>
+      <w:r>
+        <w:rPr>
+          <w:rFonts w:ascii="Times New Roman" w:eastAsiaTheme="minorEastAsia" w:hAnsi="Times New Roman" w:cs="Times New Roman"/>
+          <w:sz w:val="32"/>
+          <w:szCs w:val="32"/>
+        </w:rPr>
+        <w:t xml:space="preserve"> </w:t>
+      </w:r>
+      <w:proofErr w:type="spellStart"/>
+      <w:r>
+        <w:rPr>
+          <w:rFonts w:ascii="Times New Roman" w:eastAsiaTheme="minorEastAsia" w:hAnsi="Times New Roman" w:cs="Times New Roman"/>
+          <w:sz w:val="32"/>
+          <w:szCs w:val="32"/>
+        </w:rPr>
+        <w:t>tại</w:t>
+      </w:r>
+      <w:proofErr w:type="spellEnd"/>
+      <w:r>
+        <w:rPr>
+          <w:rFonts w:ascii="Times New Roman" w:eastAsiaTheme="minorEastAsia" w:hAnsi="Times New Roman" w:cs="Times New Roman"/>
+          <w:sz w:val="32"/>
+          <w:szCs w:val="32"/>
+        </w:rPr>
+        <w:t xml:space="preserve">. </w:t>
+      </w:r>
+      <w:proofErr w:type="spellStart"/>
+      <w:r>
+        <w:rPr>
+          <w:rFonts w:ascii="Times New Roman" w:eastAsiaTheme="minorEastAsia" w:hAnsi="Times New Roman" w:cs="Times New Roman"/>
+          <w:sz w:val="32"/>
+          <w:szCs w:val="32"/>
+        </w:rPr>
+        <w:t>Bằng</w:t>
+      </w:r>
+      <w:proofErr w:type="spellEnd"/>
+      <w:r>
+        <w:rPr>
+          <w:rFonts w:ascii="Times New Roman" w:eastAsiaTheme="minorEastAsia" w:hAnsi="Times New Roman" w:cs="Times New Roman"/>
+          <w:sz w:val="32"/>
+          <w:szCs w:val="32"/>
+        </w:rPr>
+        <w:t xml:space="preserve"> 0 </w:t>
+      </w:r>
+      <w:proofErr w:type="spellStart"/>
+      <w:r>
+        <w:rPr>
+          <w:rFonts w:ascii="Times New Roman" w:eastAsiaTheme="minorEastAsia" w:hAnsi="Times New Roman" w:cs="Times New Roman"/>
+          <w:sz w:val="32"/>
+          <w:szCs w:val="32"/>
+        </w:rPr>
+        <w:t>thì</w:t>
+      </w:r>
+      <w:proofErr w:type="spellEnd"/>
+      <w:r>
+        <w:rPr>
+          <w:rFonts w:ascii="Times New Roman" w:eastAsiaTheme="minorEastAsia" w:hAnsi="Times New Roman" w:cs="Times New Roman"/>
+          <w:sz w:val="32"/>
+          <w:szCs w:val="32"/>
+        </w:rPr>
+        <w:t xml:space="preserve"> k </w:t>
+      </w:r>
+      <w:proofErr w:type="spellStart"/>
+      <w:r>
+        <w:rPr>
+          <w:rFonts w:ascii="Times New Roman" w:eastAsiaTheme="minorEastAsia" w:hAnsi="Times New Roman" w:cs="Times New Roman"/>
+          <w:sz w:val="32"/>
+          <w:szCs w:val="32"/>
+        </w:rPr>
+        <w:t>phụ</w:t>
+      </w:r>
+      <w:proofErr w:type="spellEnd"/>
+      <w:r>
+        <w:rPr>
+          <w:rFonts w:ascii="Times New Roman" w:eastAsiaTheme="minorEastAsia" w:hAnsi="Times New Roman" w:cs="Times New Roman"/>
+          <w:sz w:val="32"/>
+          <w:szCs w:val="32"/>
+        </w:rPr>
+        <w:t xml:space="preserve"> </w:t>
+      </w:r>
+      <w:proofErr w:type="spellStart"/>
+      <w:r>
+        <w:rPr>
+          <w:rFonts w:ascii="Times New Roman" w:eastAsiaTheme="minorEastAsia" w:hAnsi="Times New Roman" w:cs="Times New Roman"/>
+          <w:sz w:val="32"/>
+          <w:szCs w:val="32"/>
+        </w:rPr>
+        <w:t>thuộc</w:t>
+      </w:r>
+      <w:proofErr w:type="spellEnd"/>
+      <w:r>
+        <w:rPr>
+          <w:rFonts w:ascii="Times New Roman" w:eastAsiaTheme="minorEastAsia" w:hAnsi="Times New Roman" w:cs="Times New Roman"/>
+          <w:sz w:val="32"/>
+          <w:szCs w:val="32"/>
+        </w:rPr>
+        <w:t xml:space="preserve"> </w:t>
+      </w:r>
+      <w:proofErr w:type="spellStart"/>
+      <w:r>
+        <w:rPr>
+          <w:rFonts w:ascii="Times New Roman" w:eastAsiaTheme="minorEastAsia" w:hAnsi="Times New Roman" w:cs="Times New Roman"/>
+          <w:sz w:val="32"/>
+          <w:szCs w:val="32"/>
+        </w:rPr>
+        <w:t>quá</w:t>
+      </w:r>
+      <w:proofErr w:type="spellEnd"/>
+      <w:r>
+        <w:rPr>
+          <w:rFonts w:ascii="Times New Roman" w:eastAsiaTheme="minorEastAsia" w:hAnsi="Times New Roman" w:cs="Times New Roman"/>
+          <w:sz w:val="32"/>
+          <w:szCs w:val="32"/>
+        </w:rPr>
+        <w:t xml:space="preserve"> </w:t>
+      </w:r>
+      <w:proofErr w:type="spellStart"/>
+      <w:r>
+        <w:rPr>
+          <w:rFonts w:ascii="Times New Roman" w:eastAsiaTheme="minorEastAsia" w:hAnsi="Times New Roman" w:cs="Times New Roman"/>
+          <w:sz w:val="32"/>
+          <w:szCs w:val="32"/>
+        </w:rPr>
+        <w:t>khứ</w:t>
+      </w:r>
+      <w:proofErr w:type="spellEnd"/>
+    </w:p>
+    <w:p>
+      <w:pPr>
+        <w:rPr>
+          <w:rFonts w:ascii="Times New Roman" w:eastAsiaTheme="minorEastAsia" w:hAnsi="Times New Roman" w:cs="Times New Roman"/>
+          <w:sz w:val="32"/>
+          <w:szCs w:val="32"/>
+        </w:rPr>
+      </w:pPr>
+    </w:p>
+    <w:p>
+      <w:pPr>
+        <w:rPr>
+          <w:rFonts w:ascii="Times New Roman" w:eastAsiaTheme="minorEastAsia" w:hAnsi="Times New Roman" w:cs="Times New Roman"/>
+          <w:sz w:val="32"/>
+          <w:szCs w:val="32"/>
+        </w:rPr>
+      </w:pPr>
+      <w:proofErr w:type="spellStart"/>
+      <w:r>
+        <w:rPr>
+          <w:rFonts w:ascii="Times New Roman" w:eastAsiaTheme="minorEastAsia" w:hAnsi="Times New Roman" w:cs="Times New Roman"/>
+          <w:sz w:val="32"/>
+          <w:szCs w:val="32"/>
+        </w:rPr>
+        <w:t>Mô</w:t>
+      </w:r>
+      <w:proofErr w:type="spellEnd"/>
+      <w:r>
+        <w:rPr>
+          <w:rFonts w:ascii="Times New Roman" w:eastAsiaTheme="minorEastAsia" w:hAnsi="Times New Roman" w:cs="Times New Roman"/>
+          <w:sz w:val="32"/>
+          <w:szCs w:val="32"/>
+        </w:rPr>
+        <w:t xml:space="preserve"> </w:t>
+      </w:r>
+      <w:proofErr w:type="spellStart"/>
+      <w:r>
+        <w:rPr>
+          <w:rFonts w:ascii="Times New Roman" w:eastAsiaTheme="minorEastAsia" w:hAnsi="Times New Roman" w:cs="Times New Roman"/>
+          <w:sz w:val="32"/>
+          <w:szCs w:val="32"/>
+        </w:rPr>
+        <w:t>hình</w:t>
+      </w:r>
+      <w:proofErr w:type="spellEnd"/>
+      <w:r>
+        <w:rPr>
+          <w:rFonts w:ascii="Times New Roman" w:eastAsiaTheme="minorEastAsia" w:hAnsi="Times New Roman" w:cs="Times New Roman"/>
+          <w:sz w:val="32"/>
+          <w:szCs w:val="32"/>
+        </w:rPr>
+        <w:t xml:space="preserve"> </w:t>
+      </w:r>
+      <w:proofErr w:type="spellStart"/>
+      <w:r>
+        <w:rPr>
+          <w:rFonts w:ascii="Times New Roman" w:eastAsiaTheme="minorEastAsia" w:hAnsi="Times New Roman" w:cs="Times New Roman"/>
+          <w:sz w:val="32"/>
+          <w:szCs w:val="32"/>
+        </w:rPr>
+        <w:t>trung</w:t>
+      </w:r>
+      <w:proofErr w:type="spellEnd"/>
+      <w:r>
+        <w:rPr>
+          <w:rFonts w:ascii="Times New Roman" w:eastAsiaTheme="minorEastAsia" w:hAnsi="Times New Roman" w:cs="Times New Roman"/>
+          <w:sz w:val="32"/>
+          <w:szCs w:val="32"/>
+        </w:rPr>
+        <w:t xml:space="preserve"> </w:t>
+      </w:r>
+      <w:proofErr w:type="spellStart"/>
+      <w:r>
+        <w:rPr>
+          <w:rFonts w:ascii="Times New Roman" w:eastAsiaTheme="minorEastAsia" w:hAnsi="Times New Roman" w:cs="Times New Roman"/>
+          <w:sz w:val="32"/>
+          <w:szCs w:val="32"/>
+        </w:rPr>
+        <w:t>bình</w:t>
+      </w:r>
+      <w:proofErr w:type="spellEnd"/>
+      <w:r>
+        <w:rPr>
+          <w:rFonts w:ascii="Times New Roman" w:eastAsiaTheme="minorEastAsia" w:hAnsi="Times New Roman" w:cs="Times New Roman"/>
+          <w:sz w:val="32"/>
+          <w:szCs w:val="32"/>
+        </w:rPr>
+        <w:t xml:space="preserve"> </w:t>
+      </w:r>
+      <w:proofErr w:type="spellStart"/>
+      <w:r>
+        <w:rPr>
+          <w:rFonts w:ascii="Times New Roman" w:eastAsiaTheme="minorEastAsia" w:hAnsi="Times New Roman" w:cs="Times New Roman"/>
+          <w:sz w:val="32"/>
+          <w:szCs w:val="32"/>
+        </w:rPr>
+        <w:t>trượt</w:t>
+      </w:r>
+      <w:proofErr w:type="spellEnd"/>
+      <w:r>
+        <w:rPr>
+          <w:rFonts w:ascii="Times New Roman" w:eastAsiaTheme="minorEastAsia" w:hAnsi="Times New Roman" w:cs="Times New Roman"/>
+          <w:sz w:val="32"/>
+          <w:szCs w:val="32"/>
+        </w:rPr>
+        <w:t xml:space="preserve"> (MA – Moving Average)</w:t>
+      </w:r>
+    </w:p>
+    <w:p>
+      <w:pPr>
+        <w:rPr>
+          <w:rFonts w:ascii="Times New Roman" w:eastAsiaTheme="minorEastAsia" w:hAnsi="Times New Roman" w:cs="Times New Roman"/>
+          <w:sz w:val="32"/>
+          <w:szCs w:val="32"/>
+        </w:rPr>
+      </w:pPr>
+      <w:proofErr w:type="spellStart"/>
+      <w:r>
+        <w:rPr>
+          <w:rFonts w:ascii="Times New Roman" w:eastAsiaTheme="minorEastAsia" w:hAnsi="Times New Roman" w:cs="Times New Roman"/>
+          <w:sz w:val="32"/>
+          <w:szCs w:val="32"/>
+        </w:rPr>
+        <w:t>Ép</w:t>
+      </w:r>
+      <w:proofErr w:type="spellEnd"/>
+      <w:r>
+        <w:rPr>
+          <w:rFonts w:ascii="Times New Roman" w:eastAsiaTheme="minorEastAsia" w:hAnsi="Times New Roman" w:cs="Times New Roman"/>
+          <w:sz w:val="32"/>
+          <w:szCs w:val="32"/>
+        </w:rPr>
+        <w:t xml:space="preserve"> </w:t>
+      </w:r>
+      <w:proofErr w:type="spellStart"/>
+      <w:r>
+        <w:rPr>
+          <w:rFonts w:ascii="Times New Roman" w:eastAsiaTheme="minorEastAsia" w:hAnsi="Times New Roman" w:cs="Times New Roman"/>
+          <w:sz w:val="32"/>
+          <w:szCs w:val="32"/>
+        </w:rPr>
+        <w:t>si</w:t>
+      </w:r>
+      <w:proofErr w:type="spellEnd"/>
+      <w:r>
+        <w:rPr>
+          <w:rFonts w:ascii="Times New Roman" w:eastAsiaTheme="minorEastAsia" w:hAnsi="Times New Roman" w:cs="Times New Roman"/>
+          <w:sz w:val="32"/>
+          <w:szCs w:val="32"/>
+        </w:rPr>
+        <w:t xml:space="preserve"> long (t-</w:t>
+      </w:r>
+      <w:proofErr w:type="spellStart"/>
+      <w:r>
+        <w:rPr>
+          <w:rFonts w:ascii="Times New Roman" w:eastAsiaTheme="minorEastAsia" w:hAnsi="Times New Roman" w:cs="Times New Roman"/>
+          <w:sz w:val="32"/>
+          <w:szCs w:val="32"/>
+        </w:rPr>
+        <w:t>i</w:t>
+      </w:r>
+      <w:proofErr w:type="spellEnd"/>
+      <w:r>
+        <w:rPr>
+          <w:rFonts w:ascii="Times New Roman" w:eastAsiaTheme="minorEastAsia" w:hAnsi="Times New Roman" w:cs="Times New Roman"/>
+          <w:sz w:val="32"/>
+          <w:szCs w:val="32"/>
+        </w:rPr>
+        <w:t xml:space="preserve">): </w:t>
+      </w:r>
+      <w:proofErr w:type="spellStart"/>
+      <w:r>
+        <w:rPr>
+          <w:rFonts w:ascii="Times New Roman" w:eastAsiaTheme="minorEastAsia" w:hAnsi="Times New Roman" w:cs="Times New Roman"/>
+          <w:sz w:val="32"/>
+          <w:szCs w:val="32"/>
+        </w:rPr>
+        <w:t>Nhiễu</w:t>
+      </w:r>
+      <w:proofErr w:type="spellEnd"/>
+      <w:r>
+        <w:rPr>
+          <w:rFonts w:ascii="Times New Roman" w:eastAsiaTheme="minorEastAsia" w:hAnsi="Times New Roman" w:cs="Times New Roman"/>
+          <w:sz w:val="32"/>
+          <w:szCs w:val="32"/>
+        </w:rPr>
+        <w:t xml:space="preserve"> </w:t>
+      </w:r>
+      <w:proofErr w:type="spellStart"/>
+      <w:r>
+        <w:rPr>
+          <w:rFonts w:ascii="Times New Roman" w:eastAsiaTheme="minorEastAsia" w:hAnsi="Times New Roman" w:cs="Times New Roman"/>
+          <w:sz w:val="32"/>
+          <w:szCs w:val="32"/>
+        </w:rPr>
+        <w:t>trắng</w:t>
+      </w:r>
+      <w:proofErr w:type="spellEnd"/>
+      <w:r>
+        <w:rPr>
+          <w:rFonts w:ascii="Times New Roman" w:eastAsiaTheme="minorEastAsia" w:hAnsi="Times New Roman" w:cs="Times New Roman"/>
+          <w:sz w:val="32"/>
+          <w:szCs w:val="32"/>
+        </w:rPr>
+        <w:t xml:space="preserve"> </w:t>
+      </w:r>
+      <w:proofErr w:type="spellStart"/>
+      <w:r>
+        <w:rPr>
+          <w:rFonts w:ascii="Times New Roman" w:eastAsiaTheme="minorEastAsia" w:hAnsi="Times New Roman" w:cs="Times New Roman"/>
+          <w:sz w:val="32"/>
+          <w:szCs w:val="32"/>
+        </w:rPr>
+        <w:t>tại</w:t>
+      </w:r>
+      <w:proofErr w:type="spellEnd"/>
+      <w:r>
+        <w:rPr>
+          <w:rFonts w:ascii="Times New Roman" w:eastAsiaTheme="minorEastAsia" w:hAnsi="Times New Roman" w:cs="Times New Roman"/>
+          <w:sz w:val="32"/>
+          <w:szCs w:val="32"/>
+        </w:rPr>
+        <w:t xml:space="preserve"> </w:t>
+      </w:r>
+      <w:proofErr w:type="spellStart"/>
+      <w:r>
+        <w:rPr>
+          <w:rFonts w:ascii="Times New Roman" w:eastAsiaTheme="minorEastAsia" w:hAnsi="Times New Roman" w:cs="Times New Roman"/>
+          <w:sz w:val="32"/>
+          <w:szCs w:val="32"/>
+        </w:rPr>
+        <w:t>thời</w:t>
+      </w:r>
+      <w:proofErr w:type="spellEnd"/>
+      <w:r>
+        <w:rPr>
+          <w:rFonts w:ascii="Times New Roman" w:eastAsiaTheme="minorEastAsia" w:hAnsi="Times New Roman" w:cs="Times New Roman"/>
+          <w:sz w:val="32"/>
+          <w:szCs w:val="32"/>
+        </w:rPr>
+        <w:t xml:space="preserve"> </w:t>
+      </w:r>
+      <w:proofErr w:type="spellStart"/>
+      <w:r>
+        <w:rPr>
+          <w:rFonts w:ascii="Times New Roman" w:eastAsiaTheme="minorEastAsia" w:hAnsi="Times New Roman" w:cs="Times New Roman"/>
+          <w:sz w:val="32"/>
+          <w:szCs w:val="32"/>
+        </w:rPr>
+        <w:t>điểm</w:t>
+      </w:r>
+      <w:proofErr w:type="spellEnd"/>
+    </w:p>
+    <w:p>
+      <w:pPr>
+        <w:rPr>
+          <w:rFonts w:ascii="Times New Roman" w:eastAsiaTheme="minorEastAsia" w:hAnsi="Times New Roman" w:cs="Times New Roman"/>
+          <w:sz w:val="32"/>
+          <w:szCs w:val="32"/>
+        </w:rPr>
+      </w:pPr>
+    </w:p>
+    <w:p>
+      <w:pPr>
+        <w:rPr>
+          <w:rFonts w:ascii="Times New Roman" w:eastAsiaTheme="minorEastAsia" w:hAnsi="Times New Roman" w:cs="Times New Roman"/>
+          <w:sz w:val="32"/>
+          <w:szCs w:val="32"/>
+        </w:rPr>
+      </w:pPr>
+      <w:r>
+        <w:rPr>
+          <w:rFonts w:ascii="Times New Roman" w:eastAsiaTheme="minorEastAsia" w:hAnsi="Times New Roman" w:cs="Times New Roman"/>
+          <w:sz w:val="32"/>
+          <w:szCs w:val="32"/>
+        </w:rPr>
+        <w:t xml:space="preserve">BTVN: Coi </w:t>
+      </w:r>
+      <w:proofErr w:type="spellStart"/>
+      <w:r>
+        <w:rPr>
+          <w:rFonts w:ascii="Times New Roman" w:eastAsiaTheme="minorEastAsia" w:hAnsi="Times New Roman" w:cs="Times New Roman"/>
+          <w:sz w:val="32"/>
+          <w:szCs w:val="32"/>
+        </w:rPr>
+        <w:t>lại</w:t>
+      </w:r>
+      <w:proofErr w:type="spellEnd"/>
+      <w:r>
+        <w:rPr>
+          <w:rFonts w:ascii="Times New Roman" w:eastAsiaTheme="minorEastAsia" w:hAnsi="Times New Roman" w:cs="Times New Roman"/>
+          <w:sz w:val="32"/>
+          <w:szCs w:val="32"/>
+        </w:rPr>
+        <w:t xml:space="preserve"> </w:t>
+      </w:r>
+      <w:proofErr w:type="spellStart"/>
+      <w:r>
+        <w:rPr>
+          <w:rFonts w:ascii="Times New Roman" w:eastAsiaTheme="minorEastAsia" w:hAnsi="Times New Roman" w:cs="Times New Roman"/>
+          <w:sz w:val="32"/>
+          <w:szCs w:val="32"/>
+        </w:rPr>
+        <w:t>chương</w:t>
+      </w:r>
+      <w:proofErr w:type="spellEnd"/>
+      <w:r>
+        <w:rPr>
+          <w:rFonts w:ascii="Times New Roman" w:eastAsiaTheme="minorEastAsia" w:hAnsi="Times New Roman" w:cs="Times New Roman"/>
+          <w:sz w:val="32"/>
+          <w:szCs w:val="32"/>
+        </w:rPr>
+        <w:t xml:space="preserve"> 3, So </w:t>
+      </w:r>
+      <w:proofErr w:type="spellStart"/>
+      <w:r>
+        <w:rPr>
+          <w:rFonts w:ascii="Times New Roman" w:eastAsiaTheme="minorEastAsia" w:hAnsi="Times New Roman" w:cs="Times New Roman"/>
+          <w:sz w:val="32"/>
+          <w:szCs w:val="32"/>
+        </w:rPr>
+        <w:t>sánh</w:t>
+      </w:r>
+      <w:proofErr w:type="spellEnd"/>
+      <w:r>
+        <w:rPr>
+          <w:rFonts w:ascii="Times New Roman" w:eastAsiaTheme="minorEastAsia" w:hAnsi="Times New Roman" w:cs="Times New Roman"/>
+          <w:sz w:val="32"/>
+          <w:szCs w:val="32"/>
+        </w:rPr>
+        <w:t xml:space="preserve"> </w:t>
+      </w:r>
+      <w:proofErr w:type="spellStart"/>
+      <w:r>
+        <w:rPr>
+          <w:rFonts w:ascii="Times New Roman" w:eastAsiaTheme="minorEastAsia" w:hAnsi="Times New Roman" w:cs="Times New Roman"/>
+          <w:sz w:val="32"/>
+          <w:szCs w:val="32"/>
+        </w:rPr>
+        <w:t>các</w:t>
+      </w:r>
+      <w:proofErr w:type="spellEnd"/>
+      <w:r>
+        <w:rPr>
+          <w:rFonts w:ascii="Times New Roman" w:eastAsiaTheme="minorEastAsia" w:hAnsi="Times New Roman" w:cs="Times New Roman"/>
+          <w:sz w:val="32"/>
+          <w:szCs w:val="32"/>
+        </w:rPr>
+        <w:t xml:space="preserve"> </w:t>
+      </w:r>
+      <w:proofErr w:type="spellStart"/>
+      <w:r>
+        <w:rPr>
+          <w:rFonts w:ascii="Times New Roman" w:eastAsiaTheme="minorEastAsia" w:hAnsi="Times New Roman" w:cs="Times New Roman"/>
+          <w:sz w:val="32"/>
+          <w:szCs w:val="32"/>
+        </w:rPr>
+        <w:t>mô</w:t>
+      </w:r>
+      <w:proofErr w:type="spellEnd"/>
+      <w:r>
+        <w:rPr>
+          <w:rFonts w:ascii="Times New Roman" w:eastAsiaTheme="minorEastAsia" w:hAnsi="Times New Roman" w:cs="Times New Roman"/>
+          <w:sz w:val="32"/>
+          <w:szCs w:val="32"/>
+        </w:rPr>
+        <w:t xml:space="preserve"> </w:t>
+      </w:r>
+      <w:proofErr w:type="spellStart"/>
+      <w:r>
+        <w:rPr>
+          <w:rFonts w:ascii="Times New Roman" w:eastAsiaTheme="minorEastAsia" w:hAnsi="Times New Roman" w:cs="Times New Roman"/>
+          <w:sz w:val="32"/>
+          <w:szCs w:val="32"/>
+        </w:rPr>
+        <w:t>hình</w:t>
+      </w:r>
+      <w:proofErr w:type="spellEnd"/>
+      <w:r>
+        <w:rPr>
+          <w:rFonts w:ascii="Times New Roman" w:eastAsiaTheme="minorEastAsia" w:hAnsi="Times New Roman" w:cs="Times New Roman"/>
+          <w:sz w:val="32"/>
+          <w:szCs w:val="32"/>
+        </w:rPr>
+        <w:t xml:space="preserve"> statis model, </w:t>
+      </w:r>
+      <w:proofErr w:type="spellStart"/>
+      <w:r>
+        <w:rPr>
+          <w:rFonts w:ascii="Times New Roman" w:eastAsiaTheme="minorEastAsia" w:hAnsi="Times New Roman" w:cs="Times New Roman"/>
+          <w:sz w:val="32"/>
+          <w:szCs w:val="32"/>
+        </w:rPr>
+        <w:t>nghiên</w:t>
+      </w:r>
+      <w:proofErr w:type="spellEnd"/>
+      <w:r>
+        <w:rPr>
+          <w:rFonts w:ascii="Times New Roman" w:eastAsiaTheme="minorEastAsia" w:hAnsi="Times New Roman" w:cs="Times New Roman"/>
+          <w:sz w:val="32"/>
+          <w:szCs w:val="32"/>
+        </w:rPr>
+        <w:t xml:space="preserve"> </w:t>
+      </w:r>
+      <w:proofErr w:type="spellStart"/>
+      <w:r>
+        <w:rPr>
+          <w:rFonts w:ascii="Times New Roman" w:eastAsiaTheme="minorEastAsia" w:hAnsi="Times New Roman" w:cs="Times New Roman"/>
+          <w:sz w:val="32"/>
+          <w:szCs w:val="32"/>
+        </w:rPr>
+        <w:t>cứu</w:t>
+      </w:r>
+      <w:proofErr w:type="spellEnd"/>
+      <w:r>
+        <w:rPr>
+          <w:rFonts w:ascii="Times New Roman" w:eastAsiaTheme="minorEastAsia" w:hAnsi="Times New Roman" w:cs="Times New Roman"/>
+          <w:sz w:val="32"/>
+          <w:szCs w:val="32"/>
+        </w:rPr>
+        <w:t xml:space="preserve"> </w:t>
+      </w:r>
     </w:p>
     <w:sectPr>
       <w:pgSz w:w="12240" w:h="15840"/>

</xml_diff>